<commit_message>
Refresh dashboard help and calculation guide
</commit_message>
<xml_diff>
--- a/docs/Council-Dashboard-Summary-Source-and-Calculation-Guide.docx
+++ b/docs/Council-Dashboard-Summary-Source-and-Calculation-Guide.docx
@@ -201,7 +201,7 @@
                 <w:color w:val="122033"/>
                 <w:sz w:val="19"/>
               </w:rPr>
-              <w:t>Aug 13, 2026</w:t>
+              <w:t>Aug 23, 2026</w:t>
             </w:r>
           </w:p>
         </w:tc>
@@ -242,7 +242,7 @@
                 <w:color w:val="122033"/>
                 <w:sz w:val="19"/>
               </w:rPr>
-              <w:t>2026-08-13_Dashboard - CAC.xlsx</w:t>
+              <w:t>2026-08-23_Dashboard - CAC.xlsx</w:t>
             </w:r>
           </w:p>
         </w:tc>
@@ -283,7 +283,7 @@
                 <w:color w:val="122033"/>
                 <w:sz w:val="19"/>
               </w:rPr>
-              <w:t>2026-08-13_CST7.xlsx</w:t>
+              <w:t>2026-08-23_CST7.xlsx</w:t>
             </w:r>
           </w:p>
         </w:tc>
@@ -324,7 +324,7 @@
                 <w:color w:val="122033"/>
                 <w:sz w:val="19"/>
               </w:rPr>
-              <w:t>2026-08-04_Membership-Hub-Field-Service-monday-export.xlsx</w:t>
+              <w:t>2026-08-23_Membership-Hub-Field-Service-monday-export.xlsx</w:t>
             </w:r>
           </w:p>
         </w:tc>
@@ -365,7 +365,7 @@
                 <w:color w:val="122033"/>
                 <w:sz w:val="19"/>
               </w:rPr>
-              <w:t>Aug 13, 2026</w:t>
+              <w:t>Aug 23, 2026</w:t>
             </w:r>
           </w:p>
         </w:tc>
@@ -504,7 +504,7 @@
         <w:pStyle w:val="BodyText"/>
       </w:pPr>
       <w:r>
-        <w:t>The Council Dashboard Summary is a static web dashboard for Capitol Area Council operating review. It brings together membership, retention, unit health, training, camping readiness, safeguarding, commissioner coverage, Service Area context, CST comparison, and monday.com operating context.</w:t>
+        <w:t>The Council Dashboard Summary is a static web dashboard for Capitol Area Council operating review. It brings together membership, retention, unit health, renewal, training, camping readiness, safeguarding, commissioner coverage, Service Area context, CST comparison, recruitment, and monday.com operating context.</w:t>
       </w:r>
     </w:p>
     <w:p>
@@ -512,7 +512,7 @@
         <w:pStyle w:val="BodyText"/>
       </w:pPr>
       <w:r>
-        <w:t>The website itself is static. It does not connect directly to Google Drive or monday.com when someone opens it. Instead, a daily local refresh process creates compact JSON data files, commits those files to GitHub, and GitHub Pages publishes the updated dashboard.</w:t>
+        <w:t>The website itself is static. It does not connect directly to Google Drive or monday.com when someone opens it. Instead, a daily local refresh process creates compact JSON and JavaScript data bundles in an isolated staging tree, verifies the payload, and deploys it through GitHub Pages Actions. Generated daily data is not committed to the source repository.</w:t>
       </w:r>
     </w:p>
     <w:p>
@@ -646,7 +646,7 @@
                 <w:color w:val="122033"/>
                 <w:sz w:val="19"/>
               </w:rPr>
-              <w:t>7,968</w:t>
+              <w:t>8,116</w:t>
             </w:r>
           </w:p>
         </w:tc>
@@ -687,7 +687,7 @@
                 <w:color w:val="122033"/>
                 <w:sz w:val="19"/>
               </w:rPr>
-              <w:t>65.5%</w:t>
+              <w:t>65.3%</w:t>
             </w:r>
           </w:p>
         </w:tc>
@@ -728,7 +728,7 @@
                 <w:color w:val="122033"/>
                 <w:sz w:val="19"/>
               </w:rPr>
-              <w:t>295</w:t>
+              <w:t>296</w:t>
             </w:r>
           </w:p>
         </w:tc>
@@ -769,7 +769,7 @@
                 <w:color w:val="122033"/>
                 <w:sz w:val="19"/>
               </w:rPr>
-              <w:t>131 (44.4%)</w:t>
+              <w:t>128 (43.2%)</w:t>
             </w:r>
           </w:p>
         </w:tc>
@@ -810,7 +810,7 @@
                 <w:color w:val="122033"/>
                 <w:sz w:val="19"/>
               </w:rPr>
-              <w:t>79 (26.8%)</w:t>
+              <w:t>84 (28.4%)</w:t>
             </w:r>
           </w:p>
         </w:tc>
@@ -851,7 +851,7 @@
                 <w:color w:val="122033"/>
                 <w:sz w:val="19"/>
               </w:rPr>
-              <w:t>96</w:t>
+              <w:t>100</w:t>
             </w:r>
           </w:p>
         </w:tc>
@@ -892,7 +892,7 @@
                 <w:color w:val="122033"/>
                 <w:sz w:val="19"/>
               </w:rPr>
-              <w:t>67</w:t>
+              <w:t>70</w:t>
             </w:r>
           </w:p>
         </w:tc>
@@ -974,7 +974,7 @@
                 <w:color w:val="122033"/>
                 <w:sz w:val="19"/>
               </w:rPr>
-              <w:t>5,554</w:t>
+              <w:t>5,672</w:t>
             </w:r>
           </w:p>
         </w:tc>
@@ -1015,7 +1015,7 @@
                 <w:color w:val="122033"/>
                 <w:sz w:val="19"/>
               </w:rPr>
-              <w:t>202</w:t>
+              <w:t>208</w:t>
             </w:r>
           </w:p>
         </w:tc>
@@ -1138,7 +1138,7 @@
                 <w:color w:val="122033"/>
                 <w:sz w:val="19"/>
               </w:rPr>
-              <w:t>291</w:t>
+              <w:t>281</w:t>
             </w:r>
           </w:p>
         </w:tc>
@@ -1179,7 +1179,7 @@
                 <w:color w:val="122033"/>
                 <w:sz w:val="19"/>
               </w:rPr>
-              <w:t>87 (29.9%)</w:t>
+              <w:t>92 (32.7%)</w:t>
             </w:r>
           </w:p>
         </w:tc>
@@ -1203,7 +1203,7 @@
         <w:pStyle w:val="BodyText"/>
       </w:pPr>
       <w:r>
-        <w:t>The dashboard has four main source lanes.</w:t>
+        <w:t>The dashboard has six main source lanes.</w:t>
       </w:r>
     </w:p>
     <w:tbl>
@@ -1508,7 +1508,7 @@
                 <w:color w:val="122033"/>
                 <w:sz w:val="19"/>
               </w:rPr>
-              <w:t>Service Area mapping</w:t>
+              <w:t>Unit Level Metrics workbook</w:t>
             </w:r>
           </w:p>
         </w:tc>
@@ -1526,7 +1526,125 @@
                 <w:color w:val="122033"/>
                 <w:sz w:val="19"/>
               </w:rPr>
-              <w:t>District-to-Service-Area assignments and Field Director ownership from Bill Kohl's authoritative Districts and Service Area email.</w:t>
+              <w:t>Unit-level youth, health, growth, training, SYT, and commissioner-assignment detail by program.</w:t>
+            </w:r>
+          </w:p>
+        </w:tc>
+        <w:tc>
+          <w:tcPr>
+            <w:tcW w:type="dxa" w:w="2160"/>
+          </w:tcPr>
+          <w:p>
+            <w:pPr>
+              <w:spacing w:after="0"/>
+            </w:pPr>
+            <w:r>
+              <w:rPr>
+                <w:rFonts w:ascii="Calibri" w:hAnsi="Calibri"/>
+                <w:color w:val="122033"/>
+                <w:sz w:val="19"/>
+              </w:rPr>
+              <w:t>`data/unit-level-latest.*`</w:t>
+            </w:r>
+          </w:p>
+        </w:tc>
+      </w:tr>
+      <w:tr>
+        <w:trPr>
+          <w:cantSplit/>
+        </w:trPr>
+        <w:tc>
+          <w:tcPr>
+            <w:tcW w:type="dxa" w:w="2200"/>
+          </w:tcPr>
+          <w:p>
+            <w:pPr>
+              <w:spacing w:after="0"/>
+            </w:pPr>
+            <w:r>
+              <w:rPr>
+                <w:rFonts w:ascii="Calibri" w:hAnsi="Calibri"/>
+                <w:color w:val="122033"/>
+                <w:sz w:val="19"/>
+              </w:rPr>
+              <w:t>Cub Scout JSN board</w:t>
+            </w:r>
+          </w:p>
+        </w:tc>
+        <w:tc>
+          <w:tcPr>
+            <w:tcW w:type="dxa" w:w="5000"/>
+          </w:tcPr>
+          <w:p>
+            <w:pPr>
+              <w:spacing w:after="0"/>
+            </w:pPr>
+            <w:r>
+              <w:rPr>
+                <w:rFonts w:ascii="Calibri" w:hAnsi="Calibri"/>
+                <w:color w:val="122033"/>
+                <w:sz w:val="19"/>
+              </w:rPr>
+              <w:t>School recruiting plans, scheduled recruitments, location and date patterns, and recruiting-material totals.</w:t>
+            </w:r>
+          </w:p>
+        </w:tc>
+        <w:tc>
+          <w:tcPr>
+            <w:tcW w:type="dxa" w:w="2160"/>
+          </w:tcPr>
+          <w:p>
+            <w:pPr>
+              <w:spacing w:after="0"/>
+            </w:pPr>
+            <w:r>
+              <w:rPr>
+                <w:rFonts w:ascii="Calibri" w:hAnsi="Calibri"/>
+                <w:color w:val="122033"/>
+                <w:sz w:val="19"/>
+              </w:rPr>
+              <w:t>`data/fall-recruitment-latest.js`</w:t>
+            </w:r>
+          </w:p>
+        </w:tc>
+      </w:tr>
+      <w:tr>
+        <w:trPr>
+          <w:cantSplit/>
+        </w:trPr>
+        <w:tc>
+          <w:tcPr>
+            <w:tcW w:type="dxa" w:w="2200"/>
+          </w:tcPr>
+          <w:p>
+            <w:pPr>
+              <w:spacing w:after="0"/>
+            </w:pPr>
+            <w:r>
+              <w:rPr>
+                <w:rFonts w:ascii="Calibri" w:hAnsi="Calibri"/>
+                <w:color w:val="122033"/>
+                <w:sz w:val="19"/>
+              </w:rPr>
+              <w:t>Service Areas board</w:t>
+            </w:r>
+          </w:p>
+        </w:tc>
+        <w:tc>
+          <w:tcPr>
+            <w:tcW w:type="dxa" w:w="5000"/>
+          </w:tcPr>
+          <w:p>
+            <w:pPr>
+              <w:spacing w:after="0"/>
+            </w:pPr>
+            <w:r>
+              <w:rPr>
+                <w:rFonts w:ascii="Calibri" w:hAnsi="Calibri"/>
+                <w:color w:val="122033"/>
+                <w:sz w:val="19"/>
+              </w:rPr>
+              <w:t>Authoritative Service Area hierarchy, Field Directors, district professionals, Volunteer Chairs, and District Commissioners.</w:t>
             </w:r>
           </w:p>
         </w:tc>
@@ -1576,7 +1694,15 @@
         <w:pStyle w:val="BodyText"/>
       </w:pPr>
       <w:r>
-        <w:t>The scheduled macOS LaunchAgents refresh the source workbooks first, then publish the two dashboard sites from their active working copies. The Council Summary site runs /Users/petersargent/CouncilDashboardSummaryUpdate.zsh and uses /Users/petersargent/CouncilDashboardSummaryRepo as its active GitHub Pages repo. The Commissioner Dashboard is a separate GitHub Pages portal that reads the same canonical Council Summary JSON, so it is updated without replacing or merging into the Council Summary site.</w:t>
+        <w:t>The consolidated CAC Dashboard Platform is the sole production writer. One scheduled macOS LaunchAgent runs the platform orchestrator, which refreshes source data and publishes the Council Summary and Commissioner sites from their active working copies. The Commissioner Dashboard remains a separate portal that reads the same canonical Council Summary data.</w:t>
+      </w:r>
+    </w:p>
+    <w:p>
+      <w:pPr>
+        <w:pStyle w:val="ListNumber"/>
+      </w:pPr>
+      <w:r>
+        <w:t>Capture the current monday.com Service Areas hierarchy and district leadership fields for this run.</w:t>
       </w:r>
     </w:p>
     <w:p>
@@ -1608,7 +1734,7 @@
         <w:pStyle w:val="ListNumber"/>
       </w:pPr>
       <w:r>
-        <w:t>Build `data/latest.json`, including Service Area rollups and a dated archive JSON file.</w:t>
+        <w:t>Build `data/latest.json`, including Service Area rollups and a dated working archive outside the Pages source tree.</w:t>
       </w:r>
     </w:p>
     <w:p>
@@ -1632,7 +1758,7 @@
         <w:pStyle w:val="ListNumber"/>
       </w:pPr>
       <w:r>
-        <w:t>Copy the refreshed JSON files to the local preview site.</w:t>
+        <w:t>Rebuild Unit-Level Detail, Renewal Status, Units-Youth history, and the Cub Scout JSN data bundle.</w:t>
       </w:r>
     </w:p>
     <w:p>
@@ -1640,7 +1766,7 @@
         <w:pStyle w:val="ListNumber"/>
       </w:pPr>
       <w:r>
-        <w:t>Publish the Council Summary site tree to GitHub Pages using historyless publishing.</w:t>
+        <w:t>Run the site-structure validator and stage the complete static site in an isolated Pages tree.</w:t>
       </w:r>
     </w:p>
     <w:p>
@@ -1648,7 +1774,7 @@
         <w:pStyle w:val="ListNumber"/>
       </w:pPr>
       <w:r>
-        <w:t>Publish the Commissioner Dashboard site tree to its separate GitHub Pages repository using historyless publishing.</w:t>
+        <w:t>Deploy the Council Summary site tree as a checksum-verified GitHub Pages artifact without committing generated data.</w:t>
       </w:r>
     </w:p>
     <w:p>
@@ -1656,7 +1782,15 @@
         <w:pStyle w:val="ListNumber"/>
       </w:pPr>
       <w:r>
-        <w:t>Let GitHub Pages publish the updated dashboard.</w:t>
+        <w:t>Deploy the Commissioner Dashboard as a verified Pages artifact only when its static payload changed.</w:t>
+      </w:r>
+    </w:p>
+    <w:p>
+      <w:pPr>
+        <w:pStyle w:val="ListNumber"/>
+      </w:pPr>
+      <w:r>
+        <w:t>Verify the GitHub Pages deployment and report the refresh result.</w:t>
       </w:r>
     </w:p>
     <w:tbl>
@@ -1773,7 +1907,7 @@
                 <w:color w:val="1F4D78"/>
                 <w:sz w:val="21"/>
               </w:rPr>
-              <w:t>Historyless publishing</w:t>
+              <w:t>Single-writer publishing</w:t>
             </w:r>
           </w:p>
           <w:p>
@@ -1786,7 +1920,7 @@
                 <w:color w:val="122033"/>
                 <w:sz w:val="21"/>
               </w:rPr>
-              <w:t>Each GitHub Pages repository is replaced with a fresh single root commit for each publish using force-with-lease protection. That keeps the public Pages repositories compact while still publishing the current static site trees.</w:t>
+              <w:t>The consolidated CAC Dashboard Platform is the only production deployer. Source changes use ordinary linear commits; daily generated data uses verified Pages artifacts without force pushes.</w:t>
             </w:r>
           </w:p>
         </w:tc>
@@ -1924,7 +2058,7 @@
                 <w:color w:val="122033"/>
                 <w:sz w:val="21"/>
               </w:rPr>
-              <w:t>The active Council Summary repo is /Users/petersargent/CouncilDashboardSummaryRepo. The Council Summary LaunchAgent is /Users/petersargent/Library/LaunchAgents/com.pbsargent.council-dashboard-summary.daily.plist. The scheduled wrapper script is /Users/petersargent/CouncilDashboardSummaryUpdate.zsh. The active Commissioner Dashboard worktree is /Users/petersargent/CACDashboardAutomation/outputs/council-commissioner-dashboard-github, and its scheduled publisher is /Users/petersargent/CACDashboardAutomation/work/commissioner_site/update_and_publish_github.zsh.</w:t>
+              <w:t>The active platform root is /Users/petersargent/CACDashboardPlatform. The sole LaunchAgent is /Users/petersargent/Library/LaunchAgents/com.cac.dashboard.macpro-daily.plist. The platform orchestrator is tools/daily_build_publish.zsh; the Council Summary updater is sites/council-dashboard-summary/update_daily.zsh.</w:t>
             </w:r>
           </w:p>
         </w:tc>
@@ -1948,7 +2082,7 @@
         <w:pStyle w:val="BodyText"/>
       </w:pPr>
       <w:r>
-        <w:t>A technical maintainer can rebuild a similar dashboard if they have the source workbooks, a Python environment with the workbook/document libraries, a GitHub Pages repository, and a daily automation path that can read the local Google Drive files and push JSON outputs.</w:t>
+        <w:t>A technical maintainer can rebuild a similar dashboard if they have the source workbooks, monday.com read access, a Python environment with the workbook/document libraries, a GitHub Pages repository, and an automation path that can build and deploy a verified static payload.</w:t>
       </w:r>
     </w:p>
     <w:tbl>
@@ -2271,7 +2405,7 @@
                 <w:color w:val="122033"/>
                 <w:sz w:val="19"/>
               </w:rPr>
-              <w:t>LaunchAgent or equivalent scheduler that refreshes source workbooks, builds changed JSON, and historylessly publishes the current site trees to GitHub.</w:t>
+              <w:t>One LaunchAgent that refreshes source data and deploys generated data as verified Pages artifacts. Ordinary linear Git commits are reserved for source changes.</w:t>
             </w:r>
           </w:p>
         </w:tc>
@@ -2294,7 +2428,7 @@
                 <w:color w:val="122033"/>
                 <w:sz w:val="19"/>
               </w:rPr>
-              <w:t>Service Area mapping</w:t>
+              <w:t>Service Area hierarchy</w:t>
             </w:r>
           </w:p>
         </w:tc>
@@ -2312,7 +2446,7 @@
                 <w:color w:val="122033"/>
                 <w:sz w:val="19"/>
               </w:rPr>
-              <w:t>Authoritative district-to-Service-Area mapping source and a maintained mapping table in the builder.</w:t>
+              <w:t>Read access to monday.com board 18420160563 for Service Areas and district leadership.</w:t>
             </w:r>
           </w:p>
         </w:tc>
@@ -2802,7 +2936,7 @@
                 <w:color w:val="122033"/>
                 <w:sz w:val="19"/>
               </w:rPr>
-              <w:t>Council youth membership divided by the raw sum of Total Available Youth from monday.com school rows.</w:t>
+              <w:t>Council: council youth divided by raw school-row TAY. Program view: actual program youth divided by estimated grade/age-eligible school TAY.</w:t>
             </w:r>
           </w:p>
         </w:tc>
@@ -2844,6 +2978,312 @@
                 <w:sz w:val="19"/>
               </w:rPr>
               <w:t>Units marked Committed divided by every unit row in the published Popcorn snapshot.</w:t>
+            </w:r>
+          </w:p>
+        </w:tc>
+      </w:tr>
+    </w:tbl>
+    <w:p>
+      <w:pPr>
+        <w:spacing w:after="80"/>
+      </w:pPr>
+    </w:p>
+    <w:p>
+      <w:pPr>
+        <w:pStyle w:val="Heading2"/>
+      </w:pPr>
+      <w:r>
+        <w:t>Master program filter</w:t>
+      </w:r>
+    </w:p>
+    <w:p>
+      <w:pPr>
+        <w:pStyle w:val="BodyText"/>
+      </w:pPr>
+      <w:r>
+        <w:t>The masthead filter carries Council, Packs, Troops, Crews, Ships, or Posts across linked pages. It uses direct unit-type fields where available and standardized unit names where a source does not publish a separate type field.</w:t>
+      </w:r>
+    </w:p>
+    <w:tbl>
+      <w:tblPr>
+        <w:tblW w:type="dxa" w:w="9360"/>
+        <w:jc w:val="left"/>
+        <w:tblLook w:firstColumn="1" w:firstRow="1" w:lastColumn="0" w:lastRow="0" w:noHBand="0" w:noVBand="1" w:val="04A0"/>
+        <w:tblInd w:w="120" w:type="dxa"/>
+        <w:tblBorders>
+          <w:top w:val="single" w:sz="6" w:space="0" w:color="CAD6E2"/>
+          <w:left w:val="single" w:sz="6" w:space="0" w:color="CAD6E2"/>
+          <w:bottom w:val="single" w:sz="6" w:space="0" w:color="CAD6E2"/>
+          <w:right w:val="single" w:sz="6" w:space="0" w:color="CAD6E2"/>
+          <w:insideH w:val="single" w:sz="6" w:space="0" w:color="CAD6E2"/>
+          <w:insideV w:val="single" w:sz="6" w:space="0" w:color="CAD6E2"/>
+        </w:tblBorders>
+      </w:tblPr>
+      <w:tblGrid>
+        <w:gridCol w:w="2600"/>
+        <w:gridCol w:w="6760"/>
+      </w:tblGrid>
+      <w:tr>
+        <w:trPr>
+          <w:cantSplit/>
+          <w:tblHeader w:val="true"/>
+        </w:trPr>
+        <w:tc>
+          <w:tcPr>
+            <w:tcW w:type="dxa" w:w="2600"/>
+            <w:tcMar>
+              <w:top w:w="80" w:type="dxa"/>
+              <w:start w:w="120" w:type="dxa"/>
+              <w:bottom w:w="80" w:type="dxa"/>
+              <w:end w:w="120" w:type="dxa"/>
+            </w:tcMar>
+            <w:vAlign w:val="center"/>
+            <w:shd w:fill="E8EEF5"/>
+          </w:tcPr>
+          <w:p>
+            <w:pPr>
+              <w:spacing w:after="0"/>
+            </w:pPr>
+            <w:r>
+              <w:rPr>
+                <w:rFonts w:ascii="Calibri" w:hAnsi="Calibri"/>
+                <w:b/>
+                <w:color w:val="122033"/>
+                <w:sz w:val="19"/>
+              </w:rPr>
+              <w:t>Source or panel</w:t>
+            </w:r>
+          </w:p>
+        </w:tc>
+        <w:tc>
+          <w:tcPr>
+            <w:tcW w:type="dxa" w:w="6760"/>
+            <w:tcMar>
+              <w:top w:w="80" w:type="dxa"/>
+              <w:start w:w="120" w:type="dxa"/>
+              <w:bottom w:w="80" w:type="dxa"/>
+              <w:end w:w="120" w:type="dxa"/>
+            </w:tcMar>
+            <w:vAlign w:val="center"/>
+            <w:shd w:fill="E8EEF5"/>
+          </w:tcPr>
+          <w:p>
+            <w:pPr>
+              <w:spacing w:after="0"/>
+            </w:pPr>
+            <w:r>
+              <w:rPr>
+                <w:rFonts w:ascii="Calibri" w:hAnsi="Calibri"/>
+                <w:b/>
+                <w:color w:val="122033"/>
+                <w:sz w:val="19"/>
+              </w:rPr>
+              <w:t>Program-view behavior</w:t>
+            </w:r>
+          </w:p>
+        </w:tc>
+      </w:tr>
+      <w:tr>
+        <w:trPr>
+          <w:cantSplit/>
+        </w:trPr>
+        <w:tc>
+          <w:tcPr>
+            <w:tcW w:type="dxa" w:w="2600"/>
+          </w:tcPr>
+          <w:p>
+            <w:pPr>
+              <w:spacing w:after="0"/>
+            </w:pPr>
+            <w:r>
+              <w:rPr>
+                <w:rFonts w:ascii="Calibri" w:hAnsi="Calibri"/>
+                <w:color w:val="122033"/>
+                <w:sz w:val="19"/>
+              </w:rPr>
+              <w:t>Unit Level Metrics</w:t>
+            </w:r>
+          </w:p>
+        </w:tc>
+        <w:tc>
+          <w:tcPr>
+            <w:tcW w:type="dxa" w:w="6760"/>
+          </w:tcPr>
+          <w:p>
+            <w:pPr>
+              <w:spacing w:after="0"/>
+            </w:pPr>
+            <w:r>
+              <w:rPr>
+                <w:rFonts w:ascii="Calibri" w:hAnsi="Calibri"/>
+                <w:color w:val="122033"/>
+                <w:sz w:val="19"/>
+              </w:rPr>
+              <w:t>Uses the direct unit_type field to rebuild youth, units, health, growth, training, SYT, and assignment rollups.</w:t>
+            </w:r>
+          </w:p>
+        </w:tc>
+      </w:tr>
+      <w:tr>
+        <w:trPr>
+          <w:cantSplit/>
+        </w:trPr>
+        <w:tc>
+          <w:tcPr>
+            <w:tcW w:type="dxa" w:w="2600"/>
+          </w:tcPr>
+          <w:p>
+            <w:pPr>
+              <w:spacing w:after="0"/>
+            </w:pPr>
+            <w:r>
+              <w:rPr>
+                <w:rFonts w:ascii="Calibri" w:hAnsi="Calibri"/>
+                <w:color w:val="122033"/>
+                <w:sz w:val="19"/>
+              </w:rPr>
+              <w:t>Training and SYT</w:t>
+            </w:r>
+          </w:p>
+        </w:tc>
+        <w:tc>
+          <w:tcPr>
+            <w:tcW w:type="dxa" w:w="6760"/>
+          </w:tcPr>
+          <w:p>
+            <w:pPr>
+              <w:spacing w:after="0"/>
+            </w:pPr>
+            <w:r>
+              <w:rPr>
+                <w:rFonts w:ascii="Calibri" w:hAnsi="Calibri"/>
+                <w:color w:val="122033"/>
+                <w:sz w:val="19"/>
+              </w:rPr>
+              <w:t>Uses each published person's direct unit_type field.</w:t>
+            </w:r>
+          </w:p>
+        </w:tc>
+      </w:tr>
+      <w:tr>
+        <w:trPr>
+          <w:cantSplit/>
+        </w:trPr>
+        <w:tc>
+          <w:tcPr>
+            <w:tcW w:type="dxa" w:w="2600"/>
+          </w:tcPr>
+          <w:p>
+            <w:pPr>
+              <w:spacing w:after="0"/>
+            </w:pPr>
+            <w:r>
+              <w:rPr>
+                <w:rFonts w:ascii="Calibri" w:hAnsi="Calibri"/>
+                <w:color w:val="122033"/>
+                <w:sz w:val="19"/>
+              </w:rPr>
+              <w:t>Prospects</w:t>
+            </w:r>
+          </w:p>
+        </w:tc>
+        <w:tc>
+          <w:tcPr>
+            <w:tcW w:type="dxa" w:w="6760"/>
+          </w:tcPr>
+          <w:p>
+            <w:pPr>
+              <w:spacing w:after="0"/>
+            </w:pPr>
+            <w:r>
+              <w:rPr>
+                <w:rFonts w:ascii="Calibri" w:hAnsi="Calibri"/>
+                <w:color w:val="122033"/>
+                <w:sz w:val="19"/>
+              </w:rPr>
+              <w:t>Uses Potential Unit Type(s); a multi-type prospect can appear in more than one program view.</w:t>
+            </w:r>
+          </w:p>
+        </w:tc>
+      </w:tr>
+      <w:tr>
+        <w:trPr>
+          <w:cantSplit/>
+        </w:trPr>
+        <w:tc>
+          <w:tcPr>
+            <w:tcW w:type="dxa" w:w="2600"/>
+          </w:tcPr>
+          <w:p>
+            <w:pPr>
+              <w:spacing w:after="0"/>
+            </w:pPr>
+            <w:r>
+              <w:rPr>
+                <w:rFonts w:ascii="Calibri" w:hAnsi="Calibri"/>
+                <w:color w:val="122033"/>
+                <w:sz w:val="19"/>
+              </w:rPr>
+              <w:t>Renewal and Popcorn</w:t>
+            </w:r>
+          </w:p>
+        </w:tc>
+        <w:tc>
+          <w:tcPr>
+            <w:tcW w:type="dxa" w:w="6760"/>
+          </w:tcPr>
+          <w:p>
+            <w:pPr>
+              <w:spacing w:after="0"/>
+            </w:pPr>
+            <w:r>
+              <w:rPr>
+                <w:rFonts w:ascii="Calibri" w:hAnsi="Calibri"/>
+                <w:color w:val="122033"/>
+                <w:sz w:val="19"/>
+              </w:rPr>
+              <w:t>Parses program from standardized unit names; Posts are excluded from the published Popcorn population.</w:t>
+            </w:r>
+          </w:p>
+        </w:tc>
+      </w:tr>
+      <w:tr>
+        <w:trPr>
+          <w:cantSplit/>
+        </w:trPr>
+        <w:tc>
+          <w:tcPr>
+            <w:tcW w:type="dxa" w:w="2600"/>
+          </w:tcPr>
+          <w:p>
+            <w:pPr>
+              <w:spacing w:after="0"/>
+            </w:pPr>
+            <w:r>
+              <w:rPr>
+                <w:rFonts w:ascii="Calibri" w:hAnsi="Calibri"/>
+                <w:color w:val="122033"/>
+                <w:sz w:val="19"/>
+              </w:rPr>
+              <w:t>Units-Youth and CST</w:t>
+            </w:r>
+          </w:p>
+        </w:tc>
+        <w:tc>
+          <w:tcPr>
+            <w:tcW w:type="dxa" w:w="6760"/>
+          </w:tcPr>
+          <w:p>
+            <w:pPr>
+              <w:spacing w:after="0"/>
+            </w:pPr>
+            <w:r>
+              <w:rPr>
+                <w:rFonts w:ascii="Calibri" w:hAnsi="Calibri"/>
+                <w:color w:val="122033"/>
+                <w:sz w:val="19"/>
+              </w:rPr>
+              <w:t>Remain council-only except for source-native Pack/Troop connection fields.</w:t>
             </w:r>
           </w:p>
         </w:tc>
@@ -3083,7 +3523,7 @@
         <w:pStyle w:val="Heading1"/>
       </w:pPr>
       <w:r>
-        <w:t>6. What Each Detail Page Adds</w:t>
+        <w:t>6. What Each Dashboard Page Adds</w:t>
       </w:r>
     </w:p>
     <w:tbl>
@@ -3161,6 +3601,252 @@
                 <w:sz w:val="19"/>
               </w:rPr>
               <w:t>What it answers</w:t>
+            </w:r>
+          </w:p>
+        </w:tc>
+      </w:tr>
+      <w:tr>
+        <w:trPr>
+          <w:cantSplit/>
+        </w:trPr>
+        <w:tc>
+          <w:tcPr>
+            <w:tcW w:type="dxa" w:w="2100"/>
+          </w:tcPr>
+          <w:p>
+            <w:pPr>
+              <w:spacing w:after="0"/>
+            </w:pPr>
+            <w:r>
+              <w:rPr>
+                <w:rFonts w:ascii="Calibri" w:hAnsi="Calibri"/>
+                <w:color w:val="122033"/>
+                <w:sz w:val="19"/>
+              </w:rPr>
+              <w:t>Overview</w:t>
+            </w:r>
+          </w:p>
+        </w:tc>
+        <w:tc>
+          <w:tcPr>
+            <w:tcW w:type="dxa" w:w="7260"/>
+          </w:tcPr>
+          <w:p>
+            <w:pPr>
+              <w:spacing w:after="0"/>
+            </w:pPr>
+            <w:r>
+              <w:rPr>
+                <w:rFonts w:ascii="Calibri" w:hAnsi="Calibri"/>
+                <w:color w:val="122033"/>
+                <w:sz w:val="19"/>
+              </w:rPr>
+              <w:t>What the Council's current KPI picture is and which operating areas need attention first.</w:t>
+            </w:r>
+          </w:p>
+        </w:tc>
+      </w:tr>
+      <w:tr>
+        <w:trPr>
+          <w:cantSplit/>
+        </w:trPr>
+        <w:tc>
+          <w:tcPr>
+            <w:tcW w:type="dxa" w:w="2100"/>
+          </w:tcPr>
+          <w:p>
+            <w:pPr>
+              <w:spacing w:after="0"/>
+            </w:pPr>
+            <w:r>
+              <w:rPr>
+                <w:rFonts w:ascii="Calibri" w:hAnsi="Calibri"/>
+                <w:color w:val="122033"/>
+                <w:sz w:val="19"/>
+              </w:rPr>
+              <w:t>Council Comparison</w:t>
+            </w:r>
+          </w:p>
+        </w:tc>
+        <w:tc>
+          <w:tcPr>
+            <w:tcW w:type="dxa" w:w="7260"/>
+          </w:tcPr>
+          <w:p>
+            <w:pPr>
+              <w:spacing w:after="0"/>
+            </w:pPr>
+            <w:r>
+              <w:rPr>
+                <w:rFonts w:ascii="Calibri" w:hAnsi="Calibri"/>
+                <w:color w:val="122033"/>
+                <w:sz w:val="19"/>
+              </w:rPr>
+              <w:t>How Capitol Area Council compares with other Service Territory 07 councils.</w:t>
+            </w:r>
+          </w:p>
+        </w:tc>
+      </w:tr>
+      <w:tr>
+        <w:trPr>
+          <w:cantSplit/>
+        </w:trPr>
+        <w:tc>
+          <w:tcPr>
+            <w:tcW w:type="dxa" w:w="2100"/>
+          </w:tcPr>
+          <w:p>
+            <w:pPr>
+              <w:spacing w:after="0"/>
+            </w:pPr>
+            <w:r>
+              <w:rPr>
+                <w:rFonts w:ascii="Calibri" w:hAnsi="Calibri"/>
+                <w:color w:val="122033"/>
+                <w:sz w:val="19"/>
+              </w:rPr>
+              <w:t>District Performance</w:t>
+            </w:r>
+          </w:p>
+        </w:tc>
+        <w:tc>
+          <w:tcPr>
+            <w:tcW w:type="dxa" w:w="7260"/>
+          </w:tcPr>
+          <w:p>
+            <w:pPr>
+              <w:spacing w:after="0"/>
+            </w:pPr>
+            <w:r>
+              <w:rPr>
+                <w:rFonts w:ascii="Calibri" w:hAnsi="Calibri"/>
+                <w:color w:val="122033"/>
+                <w:sz w:val="19"/>
+              </w:rPr>
+              <w:t>Which districts lead or lag across membership, unit health, training, SYT, and commissioner coverage.</w:t>
+            </w:r>
+          </w:p>
+        </w:tc>
+      </w:tr>
+      <w:tr>
+        <w:trPr>
+          <w:cantSplit/>
+        </w:trPr>
+        <w:tc>
+          <w:tcPr>
+            <w:tcW w:type="dxa" w:w="2100"/>
+          </w:tcPr>
+          <w:p>
+            <w:pPr>
+              <w:spacing w:after="0"/>
+            </w:pPr>
+            <w:r>
+              <w:rPr>
+                <w:rFonts w:ascii="Calibri" w:hAnsi="Calibri"/>
+                <w:color w:val="122033"/>
+                <w:sz w:val="19"/>
+              </w:rPr>
+              <w:t>Membership &amp; Growth</w:t>
+            </w:r>
+          </w:p>
+        </w:tc>
+        <w:tc>
+          <w:tcPr>
+            <w:tcW w:type="dxa" w:w="7260"/>
+          </w:tcPr>
+          <w:p>
+            <w:pPr>
+              <w:spacing w:after="0"/>
+            </w:pPr>
+            <w:r>
+              <w:rPr>
+                <w:rFonts w:ascii="Calibri" w:hAnsi="Calibri"/>
+                <w:color w:val="122033"/>
+                <w:sz w:val="19"/>
+              </w:rPr>
+              <w:t>Where membership opportunity, TAY penetration, unit health risk, prospects, and renewals combine into priority signals.</w:t>
+            </w:r>
+          </w:p>
+        </w:tc>
+      </w:tr>
+      <w:tr>
+        <w:trPr>
+          <w:cantSplit/>
+        </w:trPr>
+        <w:tc>
+          <w:tcPr>
+            <w:tcW w:type="dxa" w:w="2100"/>
+          </w:tcPr>
+          <w:p>
+            <w:pPr>
+              <w:spacing w:after="0"/>
+            </w:pPr>
+            <w:r>
+              <w:rPr>
+                <w:rFonts w:ascii="Calibri" w:hAnsi="Calibri"/>
+                <w:color w:val="122033"/>
+                <w:sz w:val="19"/>
+              </w:rPr>
+              <w:t>Unit Health &amp; Renewal</w:t>
+            </w:r>
+          </w:p>
+        </w:tc>
+        <w:tc>
+          <w:tcPr>
+            <w:tcW w:type="dxa" w:w="7260"/>
+          </w:tcPr>
+          <w:p>
+            <w:pPr>
+              <w:spacing w:after="0"/>
+            </w:pPr>
+            <w:r>
+              <w:rPr>
+                <w:rFonts w:ascii="Calibri" w:hAnsi="Calibri"/>
+                <w:color w:val="122033"/>
+                <w:sz w:val="19"/>
+              </w:rPr>
+              <w:t>Where unit health, assignment, and renewal follow-up require action.</w:t>
+            </w:r>
+          </w:p>
+        </w:tc>
+      </w:tr>
+      <w:tr>
+        <w:trPr>
+          <w:cantSplit/>
+        </w:trPr>
+        <w:tc>
+          <w:tcPr>
+            <w:tcW w:type="dxa" w:w="2100"/>
+          </w:tcPr>
+          <w:p>
+            <w:pPr>
+              <w:spacing w:after="0"/>
+            </w:pPr>
+            <w:r>
+              <w:rPr>
+                <w:rFonts w:ascii="Calibri" w:hAnsi="Calibri"/>
+                <w:color w:val="122033"/>
+                <w:sz w:val="19"/>
+              </w:rPr>
+              <w:t>People &amp; Readiness</w:t>
+            </w:r>
+          </w:p>
+        </w:tc>
+        <w:tc>
+          <w:tcPr>
+            <w:tcW w:type="dxa" w:w="7260"/>
+          </w:tcPr>
+          <w:p>
+            <w:pPr>
+              <w:spacing w:after="0"/>
+            </w:pPr>
+            <w:r>
+              <w:rPr>
+                <w:rFonts w:ascii="Calibri" w:hAnsi="Calibri"/>
+                <w:color w:val="122033"/>
+                <w:sz w:val="19"/>
+              </w:rPr>
+              <w:t>Where leader training, safeguarding, and camping-readiness gaps are concentrated.</w:t>
             </w:r>
           </w:p>
         </w:tc>
@@ -3347,7 +4033,7 @@
                 <w:color w:val="122033"/>
                 <w:sz w:val="19"/>
               </w:rPr>
-              <w:t>monday.com</w:t>
+              <w:t>Recruitment Pipeline</w:t>
             </w:r>
           </w:p>
         </w:tc>
@@ -3366,6 +4052,47 @@
                 <w:sz w:val="19"/>
               </w:rPr>
               <w:t>Where prospect, renewal, and school operating follow-up is concentrated.</w:t>
+            </w:r>
+          </w:p>
+        </w:tc>
+      </w:tr>
+      <w:tr>
+        <w:trPr>
+          <w:cantSplit/>
+        </w:trPr>
+        <w:tc>
+          <w:tcPr>
+            <w:tcW w:type="dxa" w:w="2100"/>
+          </w:tcPr>
+          <w:p>
+            <w:pPr>
+              <w:spacing w:after="0"/>
+            </w:pPr>
+            <w:r>
+              <w:rPr>
+                <w:rFonts w:ascii="Calibri" w:hAnsi="Calibri"/>
+                <w:color w:val="122033"/>
+                <w:sz w:val="19"/>
+              </w:rPr>
+              <w:t>Cub Scout JSN</w:t>
+            </w:r>
+          </w:p>
+        </w:tc>
+        <w:tc>
+          <w:tcPr>
+            <w:tcW w:type="dxa" w:w="7260"/>
+          </w:tcPr>
+          <w:p>
+            <w:pPr>
+              <w:spacing w:after="0"/>
+            </w:pPr>
+            <w:r>
+              <w:rPr>
+                <w:rFonts w:ascii="Calibri" w:hAnsi="Calibri"/>
+                <w:color w:val="122033"/>
+                <w:sz w:val="19"/>
+              </w:rPr>
+              <w:t>How school recruiting plans, dates, locations, materials, and uncovered schools compare with the monday.com source dashboard.</w:t>
             </w:r>
           </w:p>
         </w:tc>
@@ -3470,7 +4197,7 @@
                 <w:color w:val="122033"/>
                 <w:sz w:val="19"/>
               </w:rPr>
-              <w:t>Membership Intelligence</w:t>
+              <w:t>Unit-Level Detail</w:t>
             </w:r>
           </w:p>
         </w:tc>
@@ -3488,7 +4215,89 @@
                 <w:color w:val="122033"/>
                 <w:sz w:val="19"/>
               </w:rPr>
-              <w:t>Where membership opportunity, TAY penetration, unit health risk, prospects, and renewals combine into priority signals.</w:t>
+              <w:t>Which individual units and members drive program-specific youth, growth, training, SYT, health, and assignment results.</w:t>
+            </w:r>
+          </w:p>
+        </w:tc>
+      </w:tr>
+      <w:tr>
+        <w:trPr>
+          <w:cantSplit/>
+        </w:trPr>
+        <w:tc>
+          <w:tcPr>
+            <w:tcW w:type="dxa" w:w="2100"/>
+          </w:tcPr>
+          <w:p>
+            <w:pPr>
+              <w:spacing w:after="0"/>
+            </w:pPr>
+            <w:r>
+              <w:rPr>
+                <w:rFonts w:ascii="Calibri" w:hAnsi="Calibri"/>
+                <w:color w:val="122033"/>
+                <w:sz w:val="19"/>
+              </w:rPr>
+              <w:t>Renewal Status</w:t>
+            </w:r>
+          </w:p>
+        </w:tc>
+        <w:tc>
+          <w:tcPr>
+            <w:tcW w:type="dxa" w:w="7260"/>
+          </w:tcPr>
+          <w:p>
+            <w:pPr>
+              <w:spacing w:after="0"/>
+            </w:pPr>
+            <w:r>
+              <w:rPr>
+                <w:rFonts w:ascii="Calibri" w:hAnsi="Calibri"/>
+                <w:color w:val="122033"/>
+                <w:sz w:val="19"/>
+              </w:rPr>
+              <w:t>Which units are initiated, submitted, pending acceptance, posted, or otherwise need renewal follow-up.</w:t>
+            </w:r>
+          </w:p>
+        </w:tc>
+      </w:tr>
+      <w:tr>
+        <w:trPr>
+          <w:cantSplit/>
+        </w:trPr>
+        <w:tc>
+          <w:tcPr>
+            <w:tcW w:type="dxa" w:w="2100"/>
+          </w:tcPr>
+          <w:p>
+            <w:pPr>
+              <w:spacing w:after="0"/>
+            </w:pPr>
+            <w:r>
+              <w:rPr>
+                <w:rFonts w:ascii="Calibri" w:hAnsi="Calibri"/>
+                <w:color w:val="122033"/>
+                <w:sz w:val="19"/>
+              </w:rPr>
+              <w:t>Data &amp; Help</w:t>
+            </w:r>
+          </w:p>
+        </w:tc>
+        <w:tc>
+          <w:tcPr>
+            <w:tcW w:type="dxa" w:w="7260"/>
+          </w:tcPr>
+          <w:p>
+            <w:pPr>
+              <w:spacing w:after="0"/>
+            </w:pPr>
+            <w:r>
+              <w:rPr>
+                <w:rFonts w:ascii="Calibri" w:hAnsi="Calibri"/>
+                <w:color w:val="122033"/>
+                <w:sz w:val="19"/>
+              </w:rPr>
+              <w:t>Which source workbooks are current, how values are calculated, and where to report a problem.</w:t>
             </w:r>
           </w:p>
         </w:tc>
@@ -3505,6 +4314,54 @@
       </w:pPr>
       <w:r>
         <w:t>Detail pages that compare district records also expose Service Area filters. District filters remain available inside the selected Service Area, and official district views exclude operational labels that are not part of the 12-district Council dashboard structure.</w:t>
+      </w:r>
+    </w:p>
+    <w:p>
+      <w:pPr>
+        <w:pStyle w:val="Heading2"/>
+      </w:pPr>
+      <w:r>
+        <w:t>Cub Scout JSN interpretation</w:t>
+      </w:r>
+    </w:p>
+    <w:p>
+      <w:pPr>
+        <w:pStyle w:val="BodyText"/>
+      </w:pPr>
+      <w:r>
+        <w:t>The Cub Scout JSN page is rebuilt directly from monday.com board 18420720719. Its charts preserve the source dashboard's widget-specific filters rather than applying one page-wide population to every graphic.</w:t>
+      </w:r>
+    </w:p>
+    <w:p>
+      <w:pPr>
+        <w:pStyle w:val="ListBullet"/>
+      </w:pPr>
+      <w:r>
+        <w:t>District recruitment includes dated recruitments and a No Date category.</w:t>
+      </w:r>
+    </w:p>
+    <w:p>
+      <w:pPr>
+        <w:pStyle w:val="ListBullet"/>
+      </w:pPr>
+      <w:r>
+        <w:t>School-planning gaps remain pie charts with their documented Cub-target, unit-association, plan-status, and district scopes.</w:t>
+      </w:r>
+    </w:p>
+    <w:p>
+      <w:pPr>
+        <w:pStyle w:val="ListBullet"/>
+      </w:pPr>
+      <w:r>
+        <w:t>Materials gauges total the full board and retain the source dashboard's fixed gauge maxima.</w:t>
+      </w:r>
+    </w:p>
+    <w:p>
+      <w:pPr>
+        <w:pStyle w:val="ListBullet"/>
+      </w:pPr>
+      <w:r>
+        <w:t>The former expenses gauge is not part of the current monday.com dashboard and is not published.</w:t>
       </w:r>
     </w:p>
     <w:p>
@@ -3777,7 +4634,7 @@
         <w:pStyle w:val="BodyText"/>
       </w:pPr>
       <w:r>
-        <w:t>Service Area is not inferred from workbook formulas. It is a maintained mapping based on the authoritative Districts and Service Area email. The builder attaches Service Area and Field Director values to district rows, priority units, training people, commissioner records, Unit Metric Compare rows, and monday.com district contexts where an official district can be identified.</w:t>
+        <w:t>Service Area is not inferred from workbook formulas. The daily build captures the authoritative hierarchy from monday.com board 18420160563. That board also supplies Field Directors, district professionals, Volunteer Chairs, and District Commissioners; its leadership values replace workbook values, including intentional blanks. The builder attaches the hierarchy to district rows, priority units, training people, commissioner records, Unit Metric Compare rows, renewal data, and monday.com contexts where an official district can be identified.</w:t>
       </w:r>
     </w:p>
     <w:tbl>
@@ -4633,6 +5490,14 @@
         <w:pStyle w:val="ListBullet"/>
       </w:pPr>
       <w:r>
+        <w:t>Program Youth / TAY uses actual youth from units of the selected type and estimates eligible TAY by allocating each school's total evenly across its published grade or age span.</w:t>
+      </w:r>
+    </w:p>
+    <w:p>
+      <w:pPr>
+        <w:pStyle w:val="ListBullet"/>
+      </w:pPr>
+      <w:r>
         <w:t>This means district TAY context is useful for district comparison, but district TAY values should not be summed and treated as the council total.</w:t>
       </w:r>
     </w:p>
@@ -4643,6 +5508,365 @@
       <w:r>
         <w:t>Official district views exclude non-official labels such as Unassigned when comparing districts.</w:t>
       </w:r>
+    </w:p>
+    <w:tbl>
+      <w:tblPr>
+        <w:tblW w:type="dxa" w:w="9360"/>
+        <w:jc w:val="left"/>
+        <w:tblLook w:firstColumn="1" w:firstRow="1" w:lastColumn="0" w:lastRow="0" w:noHBand="0" w:noVBand="1" w:val="04A0"/>
+        <w:tblInd w:w="120" w:type="dxa"/>
+        <w:tblBorders>
+          <w:top w:val="single" w:sz="6" w:space="0" w:color="CAD6E2"/>
+          <w:left w:val="single" w:sz="6" w:space="0" w:color="CAD6E2"/>
+          <w:bottom w:val="single" w:sz="6" w:space="0" w:color="CAD6E2"/>
+          <w:right w:val="single" w:sz="6" w:space="0" w:color="CAD6E2"/>
+          <w:insideH w:val="single" w:sz="6" w:space="0" w:color="CAD6E2"/>
+          <w:insideV w:val="single" w:sz="6" w:space="0" w:color="CAD6E2"/>
+        </w:tblBorders>
+      </w:tblPr>
+      <w:tblGrid>
+        <w:gridCol w:w="2600"/>
+        <w:gridCol w:w="6760"/>
+      </w:tblGrid>
+      <w:tr>
+        <w:trPr>
+          <w:cantSplit/>
+          <w:tblHeader w:val="true"/>
+        </w:trPr>
+        <w:tc>
+          <w:tcPr>
+            <w:tcW w:type="dxa" w:w="2600"/>
+            <w:tcMar>
+              <w:top w:w="80" w:type="dxa"/>
+              <w:start w:w="120" w:type="dxa"/>
+              <w:bottom w:w="80" w:type="dxa"/>
+              <w:end w:w="120" w:type="dxa"/>
+            </w:tcMar>
+            <w:vAlign w:val="center"/>
+            <w:shd w:fill="E8EEF5"/>
+          </w:tcPr>
+          <w:p>
+            <w:pPr>
+              <w:spacing w:after="0"/>
+            </w:pPr>
+            <w:r>
+              <w:rPr>
+                <w:rFonts w:ascii="Calibri" w:hAnsi="Calibri"/>
+                <w:b/>
+                <w:color w:val="122033"/>
+                <w:sz w:val="19"/>
+              </w:rPr>
+              <w:t>Program view</w:t>
+            </w:r>
+          </w:p>
+        </w:tc>
+        <w:tc>
+          <w:tcPr>
+            <w:tcW w:type="dxa" w:w="6760"/>
+            <w:tcMar>
+              <w:top w:w="80" w:type="dxa"/>
+              <w:start w:w="120" w:type="dxa"/>
+              <w:bottom w:w="80" w:type="dxa"/>
+              <w:end w:w="120" w:type="dxa"/>
+            </w:tcMar>
+            <w:vAlign w:val="center"/>
+            <w:shd w:fill="E8EEF5"/>
+          </w:tcPr>
+          <w:p>
+            <w:pPr>
+              <w:spacing w:after="0"/>
+            </w:pPr>
+            <w:r>
+              <w:rPr>
+                <w:rFonts w:ascii="Calibri" w:hAnsi="Calibri"/>
+                <w:b/>
+                <w:color w:val="122033"/>
+                <w:sz w:val="19"/>
+              </w:rPr>
+              <w:t>Published eligibility basis</w:t>
+            </w:r>
+          </w:p>
+        </w:tc>
+      </w:tr>
+      <w:tr>
+        <w:trPr>
+          <w:cantSplit/>
+        </w:trPr>
+        <w:tc>
+          <w:tcPr>
+            <w:tcW w:type="dxa" w:w="2600"/>
+          </w:tcPr>
+          <w:p>
+            <w:pPr>
+              <w:spacing w:after="0"/>
+            </w:pPr>
+            <w:r>
+              <w:rPr>
+                <w:rFonts w:ascii="Calibri" w:hAnsi="Calibri"/>
+                <w:color w:val="122033"/>
+                <w:sz w:val="19"/>
+              </w:rPr>
+              <w:t>Packs</w:t>
+            </w:r>
+          </w:p>
+        </w:tc>
+        <w:tc>
+          <w:tcPr>
+            <w:tcW w:type="dxa" w:w="6760"/>
+          </w:tcPr>
+          <w:p>
+            <w:pPr>
+              <w:spacing w:after="0"/>
+            </w:pPr>
+            <w:r>
+              <w:rPr>
+                <w:rFonts w:ascii="Calibri" w:hAnsi="Calibri"/>
+                <w:color w:val="122033"/>
+                <w:sz w:val="19"/>
+              </w:rPr>
+              <w:t>Grades K-5 or ages 5-10</w:t>
+            </w:r>
+          </w:p>
+        </w:tc>
+      </w:tr>
+      <w:tr>
+        <w:trPr>
+          <w:cantSplit/>
+        </w:trPr>
+        <w:tc>
+          <w:tcPr>
+            <w:tcW w:type="dxa" w:w="2600"/>
+          </w:tcPr>
+          <w:p>
+            <w:pPr>
+              <w:spacing w:after="0"/>
+            </w:pPr>
+            <w:r>
+              <w:rPr>
+                <w:rFonts w:ascii="Calibri" w:hAnsi="Calibri"/>
+                <w:color w:val="122033"/>
+                <w:sz w:val="19"/>
+              </w:rPr>
+              <w:t>Troops</w:t>
+            </w:r>
+          </w:p>
+        </w:tc>
+        <w:tc>
+          <w:tcPr>
+            <w:tcW w:type="dxa" w:w="6760"/>
+          </w:tcPr>
+          <w:p>
+            <w:pPr>
+              <w:spacing w:after="0"/>
+            </w:pPr>
+            <w:r>
+              <w:rPr>
+                <w:rFonts w:ascii="Calibri" w:hAnsi="Calibri"/>
+                <w:color w:val="122033"/>
+                <w:sz w:val="19"/>
+              </w:rPr>
+              <w:t>Grades 6-12 or ages 11-17</w:t>
+            </w:r>
+          </w:p>
+        </w:tc>
+      </w:tr>
+      <w:tr>
+        <w:trPr>
+          <w:cantSplit/>
+        </w:trPr>
+        <w:tc>
+          <w:tcPr>
+            <w:tcW w:type="dxa" w:w="2600"/>
+          </w:tcPr>
+          <w:p>
+            <w:pPr>
+              <w:spacing w:after="0"/>
+            </w:pPr>
+            <w:r>
+              <w:rPr>
+                <w:rFonts w:ascii="Calibri" w:hAnsi="Calibri"/>
+                <w:color w:val="122033"/>
+                <w:sz w:val="19"/>
+              </w:rPr>
+              <w:t>Crews</w:t>
+            </w:r>
+          </w:p>
+        </w:tc>
+        <w:tc>
+          <w:tcPr>
+            <w:tcW w:type="dxa" w:w="6760"/>
+          </w:tcPr>
+          <w:p>
+            <w:pPr>
+              <w:spacing w:after="0"/>
+            </w:pPr>
+            <w:r>
+              <w:rPr>
+                <w:rFonts w:ascii="Calibri" w:hAnsi="Calibri"/>
+                <w:color w:val="122033"/>
+                <w:sz w:val="19"/>
+              </w:rPr>
+              <w:t>Grades 9-12 or ages 14-20</w:t>
+            </w:r>
+          </w:p>
+        </w:tc>
+      </w:tr>
+      <w:tr>
+        <w:trPr>
+          <w:cantSplit/>
+        </w:trPr>
+        <w:tc>
+          <w:tcPr>
+            <w:tcW w:type="dxa" w:w="2600"/>
+          </w:tcPr>
+          <w:p>
+            <w:pPr>
+              <w:spacing w:after="0"/>
+            </w:pPr>
+            <w:r>
+              <w:rPr>
+                <w:rFonts w:ascii="Calibri" w:hAnsi="Calibri"/>
+                <w:color w:val="122033"/>
+                <w:sz w:val="19"/>
+              </w:rPr>
+              <w:t>Ships</w:t>
+            </w:r>
+          </w:p>
+        </w:tc>
+        <w:tc>
+          <w:tcPr>
+            <w:tcW w:type="dxa" w:w="6760"/>
+          </w:tcPr>
+          <w:p>
+            <w:pPr>
+              <w:spacing w:after="0"/>
+            </w:pPr>
+            <w:r>
+              <w:rPr>
+                <w:rFonts w:ascii="Calibri" w:hAnsi="Calibri"/>
+                <w:color w:val="122033"/>
+                <w:sz w:val="19"/>
+              </w:rPr>
+              <w:t>Grades 9-12 or ages 14-20</w:t>
+            </w:r>
+          </w:p>
+        </w:tc>
+      </w:tr>
+      <w:tr>
+        <w:trPr>
+          <w:cantSplit/>
+        </w:trPr>
+        <w:tc>
+          <w:tcPr>
+            <w:tcW w:type="dxa" w:w="2600"/>
+          </w:tcPr>
+          <w:p>
+            <w:pPr>
+              <w:spacing w:after="0"/>
+            </w:pPr>
+            <w:r>
+              <w:rPr>
+                <w:rFonts w:ascii="Calibri" w:hAnsi="Calibri"/>
+                <w:color w:val="122033"/>
+                <w:sz w:val="19"/>
+              </w:rPr>
+              <w:t>Posts</w:t>
+            </w:r>
+          </w:p>
+        </w:tc>
+        <w:tc>
+          <w:tcPr>
+            <w:tcW w:type="dxa" w:w="6760"/>
+          </w:tcPr>
+          <w:p>
+            <w:pPr>
+              <w:spacing w:after="0"/>
+            </w:pPr>
+            <w:r>
+              <w:rPr>
+                <w:rFonts w:ascii="Calibri" w:hAnsi="Calibri"/>
+                <w:color w:val="122033"/>
+                <w:sz w:val="19"/>
+              </w:rPr>
+              <w:t>Grades 9-12 or ages 14-20</w:t>
+            </w:r>
+          </w:p>
+        </w:tc>
+      </w:tr>
+    </w:tbl>
+    <w:p>
+      <w:pPr>
+        <w:spacing w:after="80"/>
+      </w:pPr>
+    </w:p>
+    <w:tbl>
+      <w:tblPr>
+        <w:tblW w:type="dxa" w:w="9360"/>
+        <w:jc w:val="left"/>
+        <w:tblLook w:firstColumn="1" w:firstRow="1" w:lastColumn="0" w:lastRow="0" w:noHBand="0" w:noVBand="1" w:val="04A0"/>
+        <w:tblInd w:w="120" w:type="dxa"/>
+        <w:tblBorders>
+          <w:top w:val="single" w:sz="4" w:space="0" w:color="D8E0EA"/>
+          <w:left w:val="single" w:sz="4" w:space="0" w:color="D8E0EA"/>
+          <w:bottom w:val="single" w:sz="4" w:space="0" w:color="D8E0EA"/>
+          <w:right w:val="single" w:sz="4" w:space="0" w:color="D8E0EA"/>
+          <w:insideH w:val="single" w:sz="4" w:space="0" w:color="D8E0EA"/>
+          <w:insideV w:val="single" w:sz="4" w:space="0" w:color="D8E0EA"/>
+        </w:tblBorders>
+      </w:tblPr>
+      <w:tblGrid>
+        <w:gridCol w:w="9360"/>
+      </w:tblGrid>
+      <w:tr>
+        <w:trPr>
+          <w:cantSplit/>
+        </w:trPr>
+        <w:tc>
+          <w:tcPr>
+            <w:tcW w:type="dxa" w:w="9360"/>
+            <w:tcMar>
+              <w:top w:w="80" w:type="dxa"/>
+              <w:start w:w="120" w:type="dxa"/>
+              <w:bottom w:w="80" w:type="dxa"/>
+              <w:end w:w="120" w:type="dxa"/>
+            </w:tcMar>
+            <w:vAlign w:val="center"/>
+            <w:shd w:fill="F4F6F9"/>
+          </w:tcPr>
+          <w:p>
+            <w:pPr>
+              <w:spacing w:after="60"/>
+            </w:pPr>
+            <w:r>
+              <w:rPr>
+                <w:rFonts w:ascii="Calibri" w:hAnsi="Calibri"/>
+                <w:b/>
+                <w:color w:val="1F4D78"/>
+                <w:sz w:val="21"/>
+              </w:rPr>
+              <w:t>Program TAY is an estimate</w:t>
+            </w:r>
+          </w:p>
+          <w:p>
+            <w:pPr>
+              <w:spacing w:after="0"/>
+            </w:pPr>
+            <w:r>
+              <w:rPr>
+                <w:rFonts w:ascii="Calibri" w:hAnsi="Calibri"/>
+                <w:color w:val="122033"/>
+                <w:sz w:val="21"/>
+              </w:rPr>
+              <w:t>School sources do not publish enrollment by individual grade. The dashboard assumes even enrollment across each published span. Program populations overlap; fifth-grade and age-13 exceptions cannot be isolated; Exploring Clubs are not represented in Posts; and most school rows do not cover ages 18-20. Do not add program TAY estimates together.</w:t>
+            </w:r>
+          </w:p>
+        </w:tc>
+      </w:tr>
+    </w:tbl>
+    <w:p>
+      <w:pPr>
+        <w:spacing w:after="40"/>
+      </w:pPr>
     </w:p>
     <w:p>
       <w:pPr>
@@ -5579,7 +6803,7 @@
                 <w:color w:val="122033"/>
                 <w:sz w:val="19"/>
               </w:rPr>
-              <w:t>Sum of TAY for those attributed school rows.</w:t>
+              <w:t>Council view sums attributed school TAY; program views sum the estimated grade/age-eligible portion.</w:t>
             </w:r>
           </w:p>
         </w:tc>
@@ -5620,7 +6844,7 @@
                 <w:color w:val="122033"/>
                 <w:sz w:val="19"/>
               </w:rPr>
-              <w:t>Attributed school rows with a blank Unit Associated field.</w:t>
+              <w:t>Council view uses blank Unit Associated; program views require an eligible school without an associated unit matching the selected program.</w:t>
             </w:r>
           </w:p>
         </w:tc>
@@ -6248,14 +7472,6 @@
         <w:pStyle w:val="ListBullet"/>
       </w:pPr>
       <w:r>
-        <w:t>The July 1 Council dashboard workbook is broadly usable, but a small number of real Excel error cells exist, concentrated in Renewal Prep and some Objectives - Commissioners fields. Those fields should be treated cautiously until the workbook formulas are repaired.</w:t>
-      </w:r>
-    </w:p>
-    <w:p>
-      <w:pPr>
-        <w:pStyle w:val="ListBullet"/>
-      </w:pPr>
-      <w:r>
         <w:t>Expiration checks on the Training and SYT pages use the viewer browser's current date.</w:t>
       </w:r>
     </w:p>
@@ -6296,7 +7512,15 @@
         <w:pStyle w:val="ListBullet"/>
       </w:pPr>
       <w:r>
-        <w:t>Service Area filters are based on the maintained district mapping, not on source workbook columns.</w:t>
+        <w:t>Service Area filters and district leadership are based on the run-specific monday.com Service Areas capture, not on source workbook columns.</w:t>
+      </w:r>
+    </w:p>
+    <w:p>
+      <w:pPr>
+        <w:pStyle w:val="ListBullet"/>
+      </w:pPr>
+      <w:r>
+        <w:t>Program TAY values are dashboard estimates based on published school grade or age spans and must not be added together.</w:t>
       </w:r>
     </w:p>
     <w:p>
@@ -6756,6 +7980,47 @@
                 <w:color w:val="122033"/>
                 <w:sz w:val="19"/>
               </w:rPr>
+              <w:t>Program Youth / TAY</w:t>
+            </w:r>
+          </w:p>
+        </w:tc>
+        <w:tc>
+          <w:tcPr>
+            <w:tcW w:type="dxa" w:w="6660"/>
+          </w:tcPr>
+          <w:p>
+            <w:pPr>
+              <w:spacing w:after="0"/>
+            </w:pPr>
+            <w:r>
+              <w:rPr>
+                <w:rFonts w:ascii="Calibri" w:hAnsi="Calibri"/>
+                <w:color w:val="122033"/>
+                <w:sz w:val="19"/>
+              </w:rPr>
+              <w:t>Actual youth from units of the selected program divided by estimated grade/age-eligible school TAY.</w:t>
+            </w:r>
+          </w:p>
+        </w:tc>
+      </w:tr>
+      <w:tr>
+        <w:trPr>
+          <w:cantSplit/>
+        </w:trPr>
+        <w:tc>
+          <w:tcPr>
+            <w:tcW w:type="dxa" w:w="2700"/>
+          </w:tcPr>
+          <w:p>
+            <w:pPr>
+              <w:spacing w:after="0"/>
+            </w:pPr>
+            <w:r>
+              <w:rPr>
+                <w:rFonts w:ascii="Calibri" w:hAnsi="Calibri"/>
+                <w:color w:val="122033"/>
+                <w:sz w:val="19"/>
+              </w:rPr>
               <w:t>Retention</w:t>
             </w:r>
           </w:p>
@@ -7020,7 +8285,7 @@
                 <w:color w:val="122033"/>
                 <w:sz w:val="19"/>
               </w:rPr>
-              <w:t>Maintained district-to-Service-Area mapping applied after official district normalization.</w:t>
+              <w:t>Run-specific monday.com Service Areas hierarchy applied after official district normalization.</w:t>
             </w:r>
           </w:p>
         </w:tc>
@@ -7097,6 +8362,42 @@
       </w:r>
       <w:r>
         <w:t>`refresh_monday_data.py` documents the monday.com workbook/API extraction.</w:t>
+      </w:r>
+    </w:p>
+    <w:p>
+      <w:pPr>
+        <w:pStyle w:val="BodyText"/>
+        <w:ind w:left="403" w:hanging="259"/>
+      </w:pPr>
+      <w:r>
+        <w:t xml:space="preserve">•  </w:t>
+      </w:r>
+      <w:r>
+        <w:t>`tools/build_unit_level_dashboard.py` documents the Unit-Level Detail data build.</w:t>
+      </w:r>
+    </w:p>
+    <w:p>
+      <w:pPr>
+        <w:pStyle w:val="BodyText"/>
+        <w:ind w:left="403" w:hanging="259"/>
+      </w:pPr>
+      <w:r>
+        <w:t xml:space="preserve">•  </w:t>
+      </w:r>
+      <w:r>
+        <w:t>`tools/build_fall_recruitment_dashboard.py` documents the Cub Scout JSN data build.</w:t>
+      </w:r>
+    </w:p>
+    <w:p>
+      <w:pPr>
+        <w:pStyle w:val="BodyText"/>
+        <w:ind w:left="403" w:hanging="259"/>
+      </w:pPr>
+      <w:r>
+        <w:t xml:space="preserve">•  </w:t>
+      </w:r>
+      <w:r>
+        <w:t>`work/renewal_recreation/build_renewal_board_data.py` documents the Renewal Status data build.</w:t>
       </w:r>
     </w:p>
     <w:p>

</xml_diff>

<commit_message>
Synchronize camping readiness documentation
</commit_message>
<xml_diff>
--- a/docs/Council-Dashboard-Summary-Source-and-Calculation-Guide.docx
+++ b/docs/Council-Dashboard-Summary-Source-and-Calculation-Guide.docx
@@ -4169,7 +4169,7 @@
                 <w:color w:val="122033"/>
                 <w:sz w:val="19"/>
               </w:rPr>
-              <w:t>Which Packs have zero, one, or two-plus BALOO-qualified leaders and which lack a current Hazardous Weather roster signal.</w:t>
+              <w:t>Which Packs are Gap, Fragile, Preferred Depth, or Unknown for BALOO leadership depth, with Hazardous Weather filtered separately.</w:t>
             </w:r>
           </w:p>
         </w:tc>
@@ -4210,7 +4210,7 @@
                 <w:color w:val="122033"/>
                 <w:sz w:val="19"/>
               </w:rPr>
-              <w:t>Which Troops have zero, one, or two-plus IOLS-trained Scoutmasters/Assistant Scoutmasters and which lack a current Hazardous Weather roster signal.</w:t>
+              <w:t>Which Troops are Gap, Fragile, Preferred Depth, or Unknown for IOLS-trained Scoutmaster/Assistant Scoutmaster depth, with Hazardous Weather filtered separately.</w:t>
             </w:r>
           </w:p>
         </w:tc>
@@ -4415,7 +4415,7 @@
                 <w:color w:val="122033"/>
                 <w:sz w:val="19"/>
               </w:rPr>
-              <w:t>Which individual units and members drive program-specific youth, growth, training, SYT, health, and assignment results.</w:t>
+              <w:t>Which individual units and members drive program-specific youth, growth, training, SYT, health, assignment, and Pack/Troop camping-readiness status.</w:t>
             </w:r>
           </w:p>
         </w:tc>
@@ -6533,7 +6533,7 @@
         <w:pStyle w:val="BodyText"/>
       </w:pPr>
       <w:r>
-        <w:t>The Pack and Troop Camping Readiness pages group published Training-tab rows by District and unit. They are roster-readiness and training follow-up aids, not campout approvals, attendance rosters, or replacements for council and Guide to Safe Scouting requirements.</w:t>
+        <w:t>The Pack and Troop Camping Readiness pages group published Training-tab rows by District and unit. Their default tables include every reviewed unit. Leadership-depth Status can be filtered as Gap, Fragile, Preferred Depth, or Unknown, while Hazardous Weather is filtered separately as Current or Gap. The two filters can be combined with District, Sort, and Search. These pages are roster-readiness and training follow-up aids, not campout approvals, attendance rosters, or replacements for council and Guide to Safe Scouting requirements.</w:t>
       </w:r>
     </w:p>
     <w:tbl>
@@ -6651,7 +6651,7 @@
                 <w:color w:val="122033"/>
                 <w:sz w:val="19"/>
               </w:rPr>
-              <w:t>Zero recorded BALOO-qualified leaders is a gap, one is fragile coverage, and two or more is preferred continuity.</w:t>
+              <w:t>Zero recorded BALOO-qualified leaders is Gap, one is Fragile, and two or more is Preferred Depth.</w:t>
             </w:r>
           </w:p>
         </w:tc>
@@ -6733,7 +6733,7 @@
                 <w:color w:val="122033"/>
                 <w:sz w:val="19"/>
               </w:rPr>
-              <w:t>Counts IOLS-trained Scoutmasters and Assistant Scoutmasters as zero, one, or two-plus. Explicit IOLS status controls when published; absence of mandatory code S11 is the fallback.</w:t>
+              <w:t>Counts IOLS-trained Scoutmasters and Assistant Scoutmasters as Gap, Fragile, or Preferred Depth. Explicit IOLS status controls when published; absence of mandatory code S11 is the fallback.</w:t>
             </w:r>
           </w:p>
         </w:tc>
@@ -6797,7 +6797,7 @@
                 <w:color w:val="122033"/>
                 <w:sz w:val="19"/>
               </w:rPr>
-              <w:t>Overnight gap</w:t>
+              <w:t>Unknown</w:t>
             </w:r>
           </w:p>
         </w:tc>
@@ -6815,7 +6815,48 @@
                 <w:color w:val="122033"/>
                 <w:sz w:val="19"/>
               </w:rPr>
-              <w:t>Either required roster-level signal is absent. Both signals must be present for the page to show Ready based on roster.</w:t>
+              <w:t>The published Training-tab roster cannot support a leadership-depth classification for the unit. Unknown is not converted to Gap.</w:t>
+            </w:r>
+          </w:p>
+        </w:tc>
+      </w:tr>
+      <w:tr>
+        <w:trPr>
+          <w:cantSplit/>
+        </w:trPr>
+        <w:tc>
+          <w:tcPr>
+            <w:tcW w:type="dxa" w:w="3000"/>
+          </w:tcPr>
+          <w:p>
+            <w:pPr>
+              <w:spacing w:after="0"/>
+            </w:pPr>
+            <w:r>
+              <w:rPr>
+                <w:rFonts w:ascii="Calibri" w:hAnsi="Calibri"/>
+                <w:color w:val="122033"/>
+                <w:sz w:val="19"/>
+              </w:rPr>
+              <w:t>Unit-Level Detail</w:t>
+            </w:r>
+          </w:p>
+        </w:tc>
+        <w:tc>
+          <w:tcPr>
+            <w:tcW w:type="dxa" w:w="6360"/>
+          </w:tcPr>
+          <w:p>
+            <w:pPr>
+              <w:spacing w:after="0"/>
+            </w:pPr>
+            <w:r>
+              <w:rPr>
+                <w:rFonts w:ascii="Calibri" w:hAnsi="Calibri"/>
+                <w:color w:val="122033"/>
+                <w:sz w:val="19"/>
+              </w:rPr>
+              <w:t>For Packs and Troops, the same status appears in the Camping Readiness KPI and Training Readiness row. A missing Training-tab unit match appears as Unknown; other unit types do not receive this KPI.</w:t>
             </w:r>
           </w:p>
         </w:tc>
@@ -8416,7 +8457,7 @@
                 <w:color w:val="122033"/>
                 <w:sz w:val="19"/>
               </w:rPr>
-              <w:t>Pack camping readiness</w:t>
+              <w:t>Camping readiness</w:t>
             </w:r>
           </w:p>
         </w:tc>
@@ -8434,7 +8475,7 @@
                 <w:color w:val="122033"/>
                 <w:sz w:val="19"/>
               </w:rPr>
-              <w:t>BALOO depth is classified as zero (gap), one (fragile), or two-plus (preferred), alongside current direct-contact Hazardous Weather coverage.</w:t>
+              <w:t>Pack BALOO and applicable Troop SM/ASM IOLS depth are classified as Gap, Fragile, Preferred Depth, or Unknown; Hazardous Weather Current/Gap is a separate filter.</w:t>
             </w:r>
           </w:p>
         </w:tc>
@@ -8457,7 +8498,7 @@
                 <w:color w:val="122033"/>
                 <w:sz w:val="19"/>
               </w:rPr>
-              <w:t>Troop camping readiness</w:t>
+              <w:t>Unit-Level camping readiness</w:t>
             </w:r>
           </w:p>
         </w:tc>
@@ -8475,7 +8516,7 @@
                 <w:color w:val="122033"/>
                 <w:sz w:val="19"/>
               </w:rPr>
-              <w:t>Applicable SM/ASM IOLS depth is classified as zero (gap), one (fragile), or two-plus (preferred), alongside current direct-contact Hazardous Weather coverage.</w:t>
+              <w:t>Pack/Troop Unit-Level Detail uses the same shared status; an unmatched Training-tab unit is Unknown rather than Gap.</w:t>
             </w:r>
           </w:p>
         </w:tc>
@@ -8702,120 +8743,230 @@
     <w:p>
       <w:pPr>
         <w:pStyle w:val="BodyText"/>
+        <w:spacing w:after="40" w:line="240" w:lineRule="auto"/>
         <w:ind w:left="403" w:hanging="259"/>
       </w:pPr>
       <w:r>
+        <w:rPr>
+          <w:rFonts w:ascii="Calibri" w:hAnsi="Calibri"/>
+          <w:color w:val="122033"/>
+          <w:sz w:val="19"/>
+        </w:rPr>
         <w:t xml:space="preserve">•  </w:t>
       </w:r>
       <w:r>
+        <w:rPr>
+          <w:rFonts w:ascii="Calibri" w:hAnsi="Calibri"/>
+          <w:color w:val="122033"/>
+          <w:sz w:val="19"/>
+        </w:rPr>
         <w:t>`DASHBOARD_DATA_DICTIONARY.md` documents the full data dictionary and formulas.</w:t>
       </w:r>
     </w:p>
     <w:p>
       <w:pPr>
         <w:pStyle w:val="BodyText"/>
+        <w:spacing w:after="40" w:line="240" w:lineRule="auto"/>
         <w:ind w:left="403" w:hanging="259"/>
       </w:pPr>
       <w:r>
+        <w:rPr>
+          <w:rFonts w:ascii="Calibri" w:hAnsi="Calibri"/>
+          <w:color w:val="122033"/>
+          <w:sz w:val="19"/>
+        </w:rPr>
         <w:t xml:space="preserve">•  </w:t>
       </w:r>
       <w:r>
+        <w:rPr>
+          <w:rFonts w:ascii="Calibri" w:hAnsi="Calibri"/>
+          <w:color w:val="122033"/>
+          <w:sz w:val="19"/>
+        </w:rPr>
         <w:t>`IMPLEMENTATION_RUNBOOK.md` documents technical setup, source acquisition, automation, validation, and rebuild requirements.</w:t>
       </w:r>
     </w:p>
     <w:p>
       <w:pPr>
         <w:pStyle w:val="BodyText"/>
+        <w:spacing w:after="40" w:line="240" w:lineRule="auto"/>
         <w:ind w:left="403" w:hanging="259"/>
       </w:pPr>
       <w:r>
+        <w:rPr>
+          <w:rFonts w:ascii="Calibri" w:hAnsi="Calibri"/>
+          <w:color w:val="122033"/>
+          <w:sz w:val="19"/>
+        </w:rPr>
         <w:t xml:space="preserve">•  </w:t>
       </w:r>
       <w:r>
+        <w:rPr>
+          <w:rFonts w:ascii="Calibri" w:hAnsi="Calibri"/>
+          <w:color w:val="122033"/>
+          <w:sz w:val="19"/>
+        </w:rPr>
         <w:t>`update_daily.zsh` documents the automation order.</w:t>
       </w:r>
     </w:p>
     <w:p>
       <w:pPr>
         <w:pStyle w:val="BodyText"/>
+        <w:spacing w:after="40" w:line="240" w:lineRule="auto"/>
         <w:ind w:left="403" w:hanging="259"/>
       </w:pPr>
       <w:r>
+        <w:rPr>
+          <w:rFonts w:ascii="Calibri" w:hAnsi="Calibri"/>
+          <w:color w:val="122033"/>
+          <w:sz w:val="19"/>
+        </w:rPr>
         <w:t xml:space="preserve">•  </w:t>
       </w:r>
       <w:r>
+        <w:rPr>
+          <w:rFonts w:ascii="Calibri" w:hAnsi="Calibri"/>
+          <w:color w:val="122033"/>
+          <w:sz w:val="19"/>
+        </w:rPr>
         <w:t>`tools/sanitize_public_person_names.py` documents and enforces the public first-name/last-initial rule.</w:t>
       </w:r>
     </w:p>
     <w:p>
       <w:pPr>
         <w:pStyle w:val="BodyText"/>
+        <w:spacing w:after="40" w:line="240" w:lineRule="auto"/>
         <w:ind w:left="403" w:hanging="259"/>
       </w:pPr>
       <w:r>
+        <w:rPr>
+          <w:rFonts w:ascii="Calibri" w:hAnsi="Calibri"/>
+          <w:color w:val="122033"/>
+          <w:sz w:val="19"/>
+        </w:rPr>
         <w:t xml:space="preserve">•  </w:t>
       </w:r>
       <w:r>
+        <w:rPr>
+          <w:rFonts w:ascii="Calibri" w:hAnsi="Calibri"/>
+          <w:color w:val="122033"/>
+          <w:sz w:val="19"/>
+        </w:rPr>
         <w:t>`panel-help.js` documents the website's active ? help popover behavior.</w:t>
       </w:r>
     </w:p>
     <w:p>
       <w:pPr>
         <w:pStyle w:val="BodyText"/>
+        <w:spacing w:after="40" w:line="240" w:lineRule="auto"/>
         <w:ind w:left="403" w:hanging="259"/>
       </w:pPr>
       <w:r>
+        <w:rPr>
+          <w:rFonts w:ascii="Calibri" w:hAnsi="Calibri"/>
+          <w:color w:val="122033"/>
+          <w:sz w:val="19"/>
+        </w:rPr>
         <w:t xml:space="preserve">•  </w:t>
       </w:r>
       <w:r>
+        <w:rPr>
+          <w:rFonts w:ascii="Calibri" w:hAnsi="Calibri"/>
+          <w:color w:val="122033"/>
+          <w:sz w:val="19"/>
+        </w:rPr>
         <w:t>`refresh_monday_data.py` documents the monday.com workbook/API extraction.</w:t>
       </w:r>
     </w:p>
     <w:p>
       <w:pPr>
         <w:pStyle w:val="BodyText"/>
+        <w:spacing w:after="40" w:line="240" w:lineRule="auto"/>
         <w:ind w:left="403" w:hanging="259"/>
       </w:pPr>
       <w:r>
+        <w:rPr>
+          <w:rFonts w:ascii="Calibri" w:hAnsi="Calibri"/>
+          <w:color w:val="122033"/>
+          <w:sz w:val="19"/>
+        </w:rPr>
         <w:t xml:space="preserve">•  </w:t>
       </w:r>
       <w:r>
+        <w:rPr>
+          <w:rFonts w:ascii="Calibri" w:hAnsi="Calibri"/>
+          <w:color w:val="122033"/>
+          <w:sz w:val="19"/>
+        </w:rPr>
         <w:t>`tools/build_unit_level_dashboard.py` documents the Unit-Level Detail data build.</w:t>
       </w:r>
     </w:p>
     <w:p>
       <w:pPr>
         <w:pStyle w:val="BodyText"/>
+        <w:spacing w:after="40" w:line="240" w:lineRule="auto"/>
         <w:ind w:left="403" w:hanging="259"/>
       </w:pPr>
       <w:r>
+        <w:rPr>
+          <w:rFonts w:ascii="Calibri" w:hAnsi="Calibri"/>
+          <w:color w:val="122033"/>
+          <w:sz w:val="19"/>
+        </w:rPr>
         <w:t xml:space="preserve">•  </w:t>
       </w:r>
       <w:r>
+        <w:rPr>
+          <w:rFonts w:ascii="Calibri" w:hAnsi="Calibri"/>
+          <w:color w:val="122033"/>
+          <w:sz w:val="19"/>
+        </w:rPr>
         <w:t>`tools/build_fall_recruitment_dashboard.py` documents the Cub Scout JSN data build.</w:t>
       </w:r>
     </w:p>
     <w:p>
       <w:pPr>
         <w:pStyle w:val="BodyText"/>
+        <w:spacing w:after="40" w:line="240" w:lineRule="auto"/>
         <w:ind w:left="403" w:hanging="259"/>
       </w:pPr>
       <w:r>
+        <w:rPr>
+          <w:rFonts w:ascii="Calibri" w:hAnsi="Calibri"/>
+          <w:color w:val="122033"/>
+          <w:sz w:val="19"/>
+        </w:rPr>
         <w:t xml:space="preserve">•  </w:t>
       </w:r>
       <w:r>
+        <w:rPr>
+          <w:rFonts w:ascii="Calibri" w:hAnsi="Calibri"/>
+          <w:color w:val="122033"/>
+          <w:sz w:val="19"/>
+        </w:rPr>
         <w:t>`work/renewal_recreation/build_renewal_board_data.py` documents the Renewal Status data build.</w:t>
       </w:r>
     </w:p>
     <w:p>
       <w:pPr>
         <w:pStyle w:val="BodyText"/>
+        <w:spacing w:after="40" w:line="240" w:lineRule="auto"/>
         <w:ind w:left="403" w:hanging="259"/>
       </w:pPr>
       <w:r>
+        <w:rPr>
+          <w:rFonts w:ascii="Calibri" w:hAnsi="Calibri"/>
+          <w:color w:val="122033"/>
+          <w:sz w:val="19"/>
+        </w:rPr>
         <w:t xml:space="preserve">•  </w:t>
       </w:r>
       <w:r>
+        <w:rPr>
+          <w:rFonts w:ascii="Calibri" w:hAnsi="Calibri"/>
+          <w:color w:val="122033"/>
+          <w:sz w:val="19"/>
+        </w:rPr>
         <w:t>`work/commissioner_site/build_site.py` documents the source workbook parsing and `latest.json` formulas.</w:t>
       </w:r>
     </w:p>

</xml_diff>

<commit_message>
Add PIN freshness follow-up across unit dashboards
</commit_message>
<xml_diff>
--- a/docs/Council-Dashboard-Summary-Source-and-Calculation-Guide.docx
+++ b/docs/Council-Dashboard-Summary-Source-and-Calculation-Guide.docx
@@ -201,7 +201,7 @@
                 <w:color w:val="122033"/>
                 <w:sz w:val="19"/>
               </w:rPr>
-              <w:t>Aug 30, 2026</w:t>
+              <w:t>Aug 23, 2026</w:t>
             </w:r>
           </w:p>
         </w:tc>
@@ -242,7 +242,7 @@
                 <w:color w:val="122033"/>
                 <w:sz w:val="19"/>
               </w:rPr>
-              <w:t>2026-08-30_Dashboard - CAC.xlsx</w:t>
+              <w:t>2026-08-23_Dashboard - CAC.xlsx</w:t>
             </w:r>
           </w:p>
         </w:tc>
@@ -283,7 +283,7 @@
                 <w:color w:val="122033"/>
                 <w:sz w:val="19"/>
               </w:rPr>
-              <w:t>2026-08-30_CST7.xlsx</w:t>
+              <w:t>2026-08-23_CST7.xlsx</w:t>
             </w:r>
           </w:p>
         </w:tc>
@@ -324,7 +324,7 @@
                 <w:color w:val="122033"/>
                 <w:sz w:val="19"/>
               </w:rPr>
-              <w:t>2026-08-30_Membership-Hub-Field-Service-monday-export.xlsx</w:t>
+              <w:t>2026-08-23_Membership-Hub-Field-Service-monday-export.xlsx</w:t>
             </w:r>
           </w:p>
         </w:tc>
@@ -365,7 +365,7 @@
                 <w:color w:val="122033"/>
                 <w:sz w:val="19"/>
               </w:rPr>
-              <w:t>Aug 30, 2026</w:t>
+              <w:t>Aug 31, 2026</w:t>
             </w:r>
           </w:p>
         </w:tc>
@@ -646,7 +646,7 @@
                 <w:color w:val="122033"/>
                 <w:sz w:val="19"/>
               </w:rPr>
-              <w:t>8,297</w:t>
+              <w:t>8,116</w:t>
             </w:r>
           </w:p>
         </w:tc>
@@ -687,7 +687,7 @@
                 <w:color w:val="122033"/>
                 <w:sz w:val="19"/>
               </w:rPr>
-              <w:t>3,541</w:t>
+              <w:t>n/a</w:t>
             </w:r>
           </w:p>
         </w:tc>
@@ -769,7 +769,7 @@
                 <w:color w:val="122033"/>
                 <w:sz w:val="19"/>
               </w:rPr>
-              <w:t>297</w:t>
+              <w:t>296</w:t>
             </w:r>
           </w:p>
         </w:tc>
@@ -810,7 +810,7 @@
                 <w:color w:val="122033"/>
                 <w:sz w:val="19"/>
               </w:rPr>
-              <w:t>124 (41.8%)</w:t>
+              <w:t>128 (43.2%)</w:t>
             </w:r>
           </w:p>
         </w:tc>
@@ -851,7 +851,7 @@
                 <w:color w:val="122033"/>
                 <w:sz w:val="19"/>
               </w:rPr>
-              <w:t>84 (28.3%)</w:t>
+              <w:t>84 (28.4%)</w:t>
             </w:r>
           </w:p>
         </w:tc>
@@ -892,7 +892,7 @@
                 <w:color w:val="122033"/>
                 <w:sz w:val="19"/>
               </w:rPr>
-              <w:t>101</w:t>
+              <w:t>100</w:t>
             </w:r>
           </w:p>
         </w:tc>
@@ -1015,7 +1015,7 @@
                 <w:color w:val="122033"/>
                 <w:sz w:val="19"/>
               </w:rPr>
-              <w:t>5,748</w:t>
+              <w:t>5,672</w:t>
             </w:r>
           </w:p>
         </w:tc>
@@ -1056,7 +1056,7 @@
                 <w:color w:val="122033"/>
                 <w:sz w:val="19"/>
               </w:rPr>
-              <w:t>205</w:t>
+              <w:t>208</w:t>
             </w:r>
           </w:p>
         </w:tc>
@@ -1220,7 +1220,7 @@
                 <w:color w:val="122033"/>
                 <w:sz w:val="19"/>
               </w:rPr>
-              <w:t>98 (34.9%)</w:t>
+              <w:t>92 (32.7%)</w:t>
             </w:r>
           </w:p>
         </w:tc>
@@ -4005,7 +4005,7 @@
                 <w:color w:val="122033"/>
                 <w:sz w:val="19"/>
               </w:rPr>
-              <w:t>Where unit health, assignment, and renewal follow-up require action.</w:t>
+              <w:t>Where unit health, assignment, combined Inactive + Stale BeAScout PINs, and renewal follow-up require action.</w:t>
             </w:r>
           </w:p>
         </w:tc>
@@ -4415,7 +4415,7 @@
                 <w:color w:val="122033"/>
                 <w:sz w:val="19"/>
               </w:rPr>
-              <w:t>Which individual units and members drive program-specific youth, growth, training, SYT, health, assignment, and Pack/Troop camping-readiness status.</w:t>
+              <w:t>Which individual units and members drive program-specific youth, growth, training, SYT, health, assignment, BeAScout PIN status, and Pack/Troop camping-readiness status.</w:t>
             </w:r>
           </w:p>
         </w:tc>
@@ -4599,6 +4599,9 @@
     <w:p>
       <w:pPr>
         <w:pStyle w:val="ListBullet"/>
+        <w:keepNext w:val="0"/>
+        <w:keepLines/>
+        <w:spacing w:before="20" w:after="80"/>
       </w:pPr>
       <w:r>
         <w:t>District recruitment includes dated recruitments and a No Date category.</w:t>
@@ -4607,6 +4610,9 @@
     <w:p>
       <w:pPr>
         <w:pStyle w:val="ListBullet"/>
+        <w:keepNext w:val="0"/>
+        <w:keepLines/>
+        <w:spacing w:before="20" w:after="80"/>
       </w:pPr>
       <w:r>
         <w:t>School-planning gaps remain pie charts with their documented Cub-target, unit-association, plan-status, and district scopes.</w:t>
@@ -4615,6 +4621,9 @@
     <w:p>
       <w:pPr>
         <w:pStyle w:val="ListBullet"/>
+        <w:keepNext w:val="0"/>
+        <w:keepLines/>
+        <w:spacing w:before="20" w:after="80"/>
       </w:pPr>
       <w:r>
         <w:t>Materials gauges total the full board and retain the source dashboard's fixed gauge maxima.</w:t>
@@ -4623,6 +4632,9 @@
     <w:p>
       <w:pPr>
         <w:pStyle w:val="ListBullet"/>
+        <w:keepNext w:val="0"/>
+        <w:keepLines/>
+        <w:spacing w:before="20" w:after="80"/>
       </w:pPr>
       <w:r>
         <w:t>The former expenses gauge is not part of the current monday.com dashboard and is not published.</w:t>
@@ -5736,6 +5748,9 @@
     <w:p>
       <w:pPr>
         <w:pStyle w:val="ListBullet"/>
+        <w:keepNext w:val="0"/>
+        <w:keepLines/>
+        <w:spacing w:before="20" w:after="80"/>
       </w:pPr>
       <w:r>
         <w:t>Council Youth / TAY uses raw school-row TAY once per school row.</w:t>
@@ -5744,6 +5759,9 @@
     <w:p>
       <w:pPr>
         <w:pStyle w:val="ListBullet"/>
+        <w:keepNext w:val="0"/>
+        <w:keepLines/>
+        <w:spacing w:before="20" w:after="80"/>
       </w:pPr>
       <w:r>
         <w:t>District Youth / TAY attributes a school's full TAY to each official Scouting District listed for that school.</w:t>
@@ -5752,6 +5770,9 @@
     <w:p>
       <w:pPr>
         <w:pStyle w:val="ListBullet"/>
+        <w:keepNext w:val="0"/>
+        <w:keepLines/>
+        <w:spacing w:before="20" w:after="80"/>
       </w:pPr>
       <w:r>
         <w:t>Program Youth / TAY uses actual youth from units of the selected type and estimates eligible TAY by allocating each school's total evenly across its published grade or age span.</w:t>
@@ -5760,6 +5781,9 @@
     <w:p>
       <w:pPr>
         <w:pStyle w:val="ListBullet"/>
+        <w:keepNext w:val="0"/>
+        <w:keepLines/>
+        <w:spacing w:before="20" w:after="80"/>
       </w:pPr>
       <w:r>
         <w:t>This means district TAY context is useful for district comparison, but district TAY values should not be summed and treated as the council total.</w:t>
@@ -5768,6 +5792,9 @@
     <w:p>
       <w:pPr>
         <w:pStyle w:val="ListBullet"/>
+        <w:keepNext w:val="0"/>
+        <w:keepLines/>
+        <w:spacing w:before="20" w:after="80"/>
       </w:pPr>
       <w:r>
         <w:t>Official district views exclude non-official labels such as Unassigned when comparing districts.</w:t>
@@ -7792,6 +7819,9 @@
     <w:p>
       <w:pPr>
         <w:pStyle w:val="ListBullet"/>
+        <w:keepNext w:val="0"/>
+        <w:keepLines/>
+        <w:spacing w:before="20" w:after="80"/>
       </w:pPr>
       <w:r>
         <w:t>The published dashboard is only as current as the most recent successful local refresh and GitHub Pages deployment.</w:t>
@@ -7800,6 +7830,9 @@
     <w:p>
       <w:pPr>
         <w:pStyle w:val="ListBullet"/>
+        <w:keepNext w:val="0"/>
+        <w:keepLines/>
+        <w:spacing w:before="20" w:after="80"/>
       </w:pPr>
       <w:r>
         <w:t>The ? buttons provide quick panel context in the website. They are not a replacement for this guide or the Markdown data dictionary.</w:t>
@@ -7808,6 +7841,9 @@
     <w:p>
       <w:pPr>
         <w:pStyle w:val="ListBullet"/>
+        <w:keepNext w:val="0"/>
+        <w:keepLines/>
+        <w:spacing w:before="20" w:after="80"/>
       </w:pPr>
       <w:r>
         <w:t>Workbook labels and sheet names matter. If a source workbook changes structure, the refresh may need a code update.</w:t>
@@ -7816,6 +7852,9 @@
     <w:p>
       <w:pPr>
         <w:pStyle w:val="ListBullet"/>
+        <w:keepNext w:val="0"/>
+        <w:keepLines/>
+        <w:spacing w:before="20" w:after="80"/>
       </w:pPr>
       <w:r>
         <w:t>Expiration checks on the Training and SYT pages use the viewer browser's current date.</w:t>
@@ -7824,6 +7863,9 @@
     <w:p>
       <w:pPr>
         <w:pStyle w:val="ListBullet"/>
+        <w:keepNext w:val="0"/>
+        <w:keepLines/>
+        <w:spacing w:before="20" w:after="80"/>
       </w:pPr>
       <w:r>
         <w:t>Freshness timestamps are displayed in the viewer browser's local timezone, so the same data snapshot can show different clock times to viewers in different timezones.</w:t>
@@ -7832,6 +7874,9 @@
     <w:p>
       <w:pPr>
         <w:pStyle w:val="ListBullet"/>
+        <w:keepNext w:val="0"/>
+        <w:keepLines/>
+        <w:spacing w:before="20" w:after="80"/>
       </w:pPr>
       <w:r>
         <w:t>The SYT detail page flags SYT for all leaders. It flags Hazardous Weather, BALOO, and IOLS only when they are required by the leader's role and unit type.</w:t>
@@ -7840,6 +7885,9 @@
     <w:p>
       <w:pPr>
         <w:pStyle w:val="ListBullet"/>
+        <w:keepNext w:val="0"/>
+        <w:keepLines/>
+        <w:spacing w:before="20" w:after="80"/>
       </w:pPr>
       <w:r>
         <w:t>The Pack and Troop Camping Readiness pages evaluate roster-level training signals from the published snapshot; they do not confirm campout attendance or approval.</w:t>
@@ -7848,6 +7896,9 @@
     <w:p>
       <w:pPr>
         <w:pStyle w:val="ListBullet"/>
+        <w:keepNext w:val="0"/>
+        <w:keepLines/>
+        <w:spacing w:before="20" w:after="80"/>
       </w:pPr>
       <w:r>
         <w:t>monday.com district labels can include operational labels that are not official dashboard districts; official district charts filter those out.</w:t>
@@ -7856,6 +7907,9 @@
     <w:p>
       <w:pPr>
         <w:pStyle w:val="ListBullet"/>
+        <w:keepNext w:val="0"/>
+        <w:keepLines/>
+        <w:spacing w:before="20" w:after="80"/>
       </w:pPr>
       <w:r>
         <w:t>Service Area filters and district leadership are based on the run-specific monday.com Service Areas capture, not on source workbook columns.</w:t>
@@ -7864,6 +7918,9 @@
     <w:p>
       <w:pPr>
         <w:pStyle w:val="ListBullet"/>
+        <w:keepNext w:val="0"/>
+        <w:keepLines/>
+        <w:spacing w:before="20" w:after="80"/>
       </w:pPr>
       <w:r>
         <w:t>Program TAY values are dashboard estimates based on published school grade or age spans and must not be added together.</w:t>
@@ -7872,6 +7929,9 @@
     <w:p>
       <w:pPr>
         <w:pStyle w:val="ListBullet"/>
+        <w:keepNext w:val="0"/>
+        <w:keepLines/>
+        <w:spacing w:before="20" w:after="80"/>
       </w:pPr>
       <w:r>
         <w:t>Popcorn participation counts every published unit row in the denominator and only rows marked Committed in the numerator.</w:t>
@@ -7880,6 +7940,9 @@
     <w:p>
       <w:pPr>
         <w:pStyle w:val="ListBullet"/>
+        <w:keepNext w:val="0"/>
+        <w:keepLines/>
+        <w:spacing w:before="20" w:after="80"/>
       </w:pPr>
       <w:r>
         <w:t>Popcorn contact names, email addresses, and phone numbers are excluded from the public JSON and dashboard.</w:t>
@@ -7888,6 +7951,9 @@
     <w:p>
       <w:pPr>
         <w:pStyle w:val="ListBullet"/>
+        <w:keepNext w:val="0"/>
+        <w:keepLines/>
+        <w:spacing w:before="20" w:after="80"/>
       </w:pPr>
       <w:r>
         <w:t>Across all public Council Summary and Commissioner outputs, person names display as first name plus last initial. The publication gate stops deployment if a covered full name remains.</w:t>
@@ -7896,6 +7962,9 @@
     <w:p>
       <w:pPr>
         <w:pStyle w:val="ListBullet"/>
+        <w:keepNext w:val="0"/>
+        <w:keepLines/>
+        <w:spacing w:before="20" w:after="80"/>
       </w:pPr>
       <w:r>
         <w:t>The Markdown data dictionary remains the best place for exact formulas and implementation details.</w:t>
@@ -8681,6 +8750,88 @@
                 <w:sz w:val="19"/>
               </w:rPr>
               <w:t>Completed Commissioner Connection History rows in the 365 days ending on the report date, limited to official districts.</w:t>
+            </w:r>
+          </w:p>
+        </w:tc>
+      </w:tr>
+      <w:tr>
+        <w:trPr>
+          <w:cantSplit/>
+        </w:trPr>
+        <w:tc>
+          <w:tcPr>
+            <w:tcW w:type="dxa" w:w="2700"/>
+          </w:tcPr>
+          <w:p>
+            <w:pPr>
+              <w:spacing w:after="0"/>
+            </w:pPr>
+            <w:r>
+              <w:rPr>
+                <w:rFonts w:ascii="Calibri" w:hAnsi="Calibri"/>
+                <w:color w:val="122033"/>
+                <w:sz w:val="19"/>
+              </w:rPr>
+              <w:t>PIN state</w:t>
+            </w:r>
+          </w:p>
+        </w:tc>
+        <w:tc>
+          <w:tcPr>
+            <w:tcW w:type="dxa" w:w="6660"/>
+          </w:tcPr>
+          <w:p>
+            <w:pPr>
+              <w:spacing w:after="0"/>
+            </w:pPr>
+            <w:r>
+              <w:rPr>
+                <w:rFonts w:ascii="Calibri" w:hAnsi="Calibri"/>
+                <w:color w:val="122033"/>
+                <w:sz w:val="19"/>
+              </w:rPr>
+              <w:t>Stale when a matched BeAScout PIN last-modified date is blank or earlier than the same calendar date one year before publication; otherwise retain Active or Inactive.</w:t>
+            </w:r>
+          </w:p>
+        </w:tc>
+      </w:tr>
+      <w:tr>
+        <w:trPr>
+          <w:cantSplit/>
+        </w:trPr>
+        <w:tc>
+          <w:tcPr>
+            <w:tcW w:type="dxa" w:w="2700"/>
+          </w:tcPr>
+          <w:p>
+            <w:pPr>
+              <w:spacing w:after="0"/>
+            </w:pPr>
+            <w:r>
+              <w:rPr>
+                <w:rFonts w:ascii="Calibri" w:hAnsi="Calibri"/>
+                <w:color w:val="122033"/>
+                <w:sz w:val="19"/>
+              </w:rPr>
+              <w:t>Inactive + stale PINs</w:t>
+            </w:r>
+          </w:p>
+        </w:tc>
+        <w:tc>
+          <w:tcPr>
+            <w:tcW w:type="dxa" w:w="6660"/>
+          </w:tcPr>
+          <w:p>
+            <w:pPr>
+              <w:spacing w:after="0"/>
+            </w:pPr>
+            <w:r>
+              <w:rPr>
+                <w:rFonts w:ascii="Calibri" w:hAnsi="Calibri"/>
+                <w:color w:val="122033"/>
+                <w:sz w:val="19"/>
+              </w:rPr>
+              <w:t>Count of PIN rows in either Inactive or Stale state, divided by all units in the current master program view for the funnel percentage.</w:t>
             </w:r>
           </w:p>
         </w:tc>

</xml_diff>

<commit_message>
Refresh PIN documentation and reader guide
</commit_message>
<xml_diff>
--- a/docs/Council-Dashboard-Summary-Source-and-Calculation-Guide.docx
+++ b/docs/Council-Dashboard-Summary-Source-and-Calculation-Guide.docx
@@ -201,7 +201,7 @@
                 <w:color w:val="122033"/>
                 <w:sz w:val="19"/>
               </w:rPr>
-              <w:t>Aug 23, 2026</w:t>
+              <w:t>Aug 31, 2026</w:t>
             </w:r>
           </w:p>
         </w:tc>
@@ -242,7 +242,7 @@
                 <w:color w:val="122033"/>
                 <w:sz w:val="19"/>
               </w:rPr>
-              <w:t>2026-08-23_Dashboard - CAC.xlsx</w:t>
+              <w:t>2026-08-31_Dashboard - CAC.xlsx</w:t>
             </w:r>
           </w:p>
         </w:tc>
@@ -283,7 +283,7 @@
                 <w:color w:val="122033"/>
                 <w:sz w:val="19"/>
               </w:rPr>
-              <w:t>2026-08-23_CST7.xlsx</w:t>
+              <w:t>2026-08-31_CST7.xlsx</w:t>
             </w:r>
           </w:p>
         </w:tc>
@@ -324,7 +324,7 @@
                 <w:color w:val="122033"/>
                 <w:sz w:val="19"/>
               </w:rPr>
-              <w:t>2026-08-23_Membership-Hub-Field-Service-monday-export.xlsx</w:t>
+              <w:t>2026-08-31_Membership-Hub-Field-Service-monday-export.xlsx</w:t>
             </w:r>
           </w:p>
         </w:tc>
@@ -646,7 +646,7 @@
                 <w:color w:val="122033"/>
                 <w:sz w:val="19"/>
               </w:rPr>
-              <w:t>8,116</w:t>
+              <w:t>8,309</w:t>
             </w:r>
           </w:p>
         </w:tc>
@@ -687,7 +687,7 @@
                 <w:color w:val="122033"/>
                 <w:sz w:val="19"/>
               </w:rPr>
-              <w:t>n/a</w:t>
+              <w:t>3,546</w:t>
             </w:r>
           </w:p>
         </w:tc>
@@ -769,7 +769,7 @@
                 <w:color w:val="122033"/>
                 <w:sz w:val="19"/>
               </w:rPr>
-              <w:t>296</w:t>
+              <w:t>297</w:t>
             </w:r>
           </w:p>
         </w:tc>
@@ -810,7 +810,7 @@
                 <w:color w:val="122033"/>
                 <w:sz w:val="19"/>
               </w:rPr>
-              <w:t>128 (43.2%)</w:t>
+              <w:t>121 (40.7%)</w:t>
             </w:r>
           </w:p>
         </w:tc>
@@ -851,7 +851,7 @@
                 <w:color w:val="122033"/>
                 <w:sz w:val="19"/>
               </w:rPr>
-              <w:t>84 (28.4%)</w:t>
+              <w:t>86 (29.0%)</w:t>
             </w:r>
           </w:p>
         </w:tc>
@@ -892,7 +892,7 @@
                 <w:color w:val="122033"/>
                 <w:sz w:val="19"/>
               </w:rPr>
-              <w:t>100</w:t>
+              <w:t>101</w:t>
             </w:r>
           </w:p>
         </w:tc>
@@ -1015,7 +1015,7 @@
                 <w:color w:val="122033"/>
                 <w:sz w:val="19"/>
               </w:rPr>
-              <w:t>5,672</w:t>
+              <w:t>5,759</w:t>
             </w:r>
           </w:p>
         </w:tc>
@@ -1056,7 +1056,7 @@
                 <w:color w:val="122033"/>
                 <w:sz w:val="19"/>
               </w:rPr>
-              <w:t>208</w:t>
+              <w:t>205</w:t>
             </w:r>
           </w:p>
         </w:tc>
@@ -1220,7 +1220,7 @@
                 <w:color w:val="122033"/>
                 <w:sz w:val="19"/>
               </w:rPr>
-              <w:t>92 (32.7%)</w:t>
+              <w:t>98 (34.9%)</w:t>
             </w:r>
           </w:p>
         </w:tc>
@@ -3720,6 +3720,340 @@
     </w:p>
     <w:p>
       <w:pPr>
+        <w:pStyle w:val="Heading2"/>
+      </w:pPr>
+      <w:r>
+        <w:t>BeAScout PIN status and follow-up</w:t>
+      </w:r>
+    </w:p>
+    <w:p>
+      <w:pPr>
+        <w:pStyle w:val="BodyText"/>
+      </w:pPr>
+      <w:r>
+        <w:t>The dashboard uses one PIN classification in Unit Follow-up, the first Unit-Level Detail KPI, and the Unit Health Funnel. It does not treat a missing match as an inactive PIN.</w:t>
+      </w:r>
+    </w:p>
+    <w:tbl>
+      <w:tblPr>
+        <w:tblW w:type="dxa" w:w="9360"/>
+        <w:jc w:val="left"/>
+        <w:tblLook w:firstColumn="1" w:firstRow="1" w:lastColumn="0" w:lastRow="0" w:noHBand="0" w:noVBand="1" w:val="04A0"/>
+        <w:tblInd w:w="120" w:type="dxa"/>
+        <w:tblBorders>
+          <w:top w:val="single" w:sz="6" w:space="0" w:color="CAD6E2"/>
+          <w:left w:val="single" w:sz="6" w:space="0" w:color="CAD6E2"/>
+          <w:bottom w:val="single" w:sz="6" w:space="0" w:color="CAD6E2"/>
+          <w:right w:val="single" w:sz="6" w:space="0" w:color="CAD6E2"/>
+          <w:insideH w:val="single" w:sz="6" w:space="0" w:color="CAD6E2"/>
+          <w:insideV w:val="single" w:sz="6" w:space="0" w:color="CAD6E2"/>
+        </w:tblBorders>
+      </w:tblPr>
+      <w:tblGrid>
+        <w:gridCol w:w="1800"/>
+        <w:gridCol w:w="7560"/>
+      </w:tblGrid>
+      <w:tr>
+        <w:trPr>
+          <w:cantSplit/>
+          <w:tblHeader w:val="true"/>
+        </w:trPr>
+        <w:tc>
+          <w:tcPr>
+            <w:tcW w:type="dxa" w:w="1800"/>
+            <w:tcMar>
+              <w:top w:w="80" w:type="dxa"/>
+              <w:start w:w="120" w:type="dxa"/>
+              <w:bottom w:w="80" w:type="dxa"/>
+              <w:end w:w="120" w:type="dxa"/>
+            </w:tcMar>
+            <w:vAlign w:val="center"/>
+            <w:shd w:fill="E8EEF5"/>
+          </w:tcPr>
+          <w:p>
+            <w:pPr>
+              <w:spacing w:after="0"/>
+            </w:pPr>
+            <w:r>
+              <w:rPr>
+                <w:rFonts w:ascii="Calibri" w:hAnsi="Calibri"/>
+                <w:b/>
+                <w:color w:val="122033"/>
+                <w:sz w:val="19"/>
+              </w:rPr>
+              <w:t>Display state</w:t>
+            </w:r>
+          </w:p>
+        </w:tc>
+        <w:tc>
+          <w:tcPr>
+            <w:tcW w:type="dxa" w:w="7560"/>
+            <w:tcMar>
+              <w:top w:w="80" w:type="dxa"/>
+              <w:start w:w="120" w:type="dxa"/>
+              <w:bottom w:w="80" w:type="dxa"/>
+              <w:end w:w="120" w:type="dxa"/>
+            </w:tcMar>
+            <w:vAlign w:val="center"/>
+            <w:shd w:fill="E8EEF5"/>
+          </w:tcPr>
+          <w:p>
+            <w:pPr>
+              <w:spacing w:after="0"/>
+            </w:pPr>
+            <w:r>
+              <w:rPr>
+                <w:rFonts w:ascii="Calibri" w:hAnsi="Calibri"/>
+                <w:b/>
+                <w:color w:val="122033"/>
+                <w:sz w:val="19"/>
+              </w:rPr>
+              <w:t>Plain-English meaning</w:t>
+            </w:r>
+          </w:p>
+        </w:tc>
+      </w:tr>
+      <w:tr>
+        <w:trPr>
+          <w:cantSplit/>
+        </w:trPr>
+        <w:tc>
+          <w:tcPr>
+            <w:tcW w:type="dxa" w:w="1800"/>
+          </w:tcPr>
+          <w:p>
+            <w:pPr>
+              <w:spacing w:after="0"/>
+            </w:pPr>
+            <w:r>
+              <w:rPr>
+                <w:rFonts w:ascii="Calibri" w:hAnsi="Calibri"/>
+                <w:color w:val="122033"/>
+                <w:sz w:val="19"/>
+              </w:rPr>
+              <w:t>Active</w:t>
+            </w:r>
+          </w:p>
+        </w:tc>
+        <w:tc>
+          <w:tcPr>
+            <w:tcW w:type="dxa" w:w="7560"/>
+          </w:tcPr>
+          <w:p>
+            <w:pPr>
+              <w:spacing w:after="0"/>
+            </w:pPr>
+            <w:r>
+              <w:rPr>
+                <w:rFonts w:ascii="Calibri" w:hAnsi="Calibri"/>
+                <w:color w:val="122033"/>
+                <w:sz w:val="19"/>
+              </w:rPr>
+              <w:t>The matched PIN is current and the source state is Active.</w:t>
+            </w:r>
+          </w:p>
+        </w:tc>
+      </w:tr>
+      <w:tr>
+        <w:trPr>
+          <w:cantSplit/>
+        </w:trPr>
+        <w:tc>
+          <w:tcPr>
+            <w:tcW w:type="dxa" w:w="1800"/>
+          </w:tcPr>
+          <w:p>
+            <w:pPr>
+              <w:spacing w:after="0"/>
+            </w:pPr>
+            <w:r>
+              <w:rPr>
+                <w:rFonts w:ascii="Calibri" w:hAnsi="Calibri"/>
+                <w:color w:val="122033"/>
+                <w:sz w:val="19"/>
+              </w:rPr>
+              <w:t>Inactive</w:t>
+            </w:r>
+          </w:p>
+        </w:tc>
+        <w:tc>
+          <w:tcPr>
+            <w:tcW w:type="dxa" w:w="7560"/>
+          </w:tcPr>
+          <w:p>
+            <w:pPr>
+              <w:spacing w:after="0"/>
+            </w:pPr>
+            <w:r>
+              <w:rPr>
+                <w:rFonts w:ascii="Calibri" w:hAnsi="Calibri"/>
+                <w:color w:val="122033"/>
+                <w:sz w:val="19"/>
+              </w:rPr>
+              <w:t>The matched PIN is current and the source state is Inactive.</w:t>
+            </w:r>
+          </w:p>
+        </w:tc>
+      </w:tr>
+      <w:tr>
+        <w:trPr>
+          <w:cantSplit/>
+        </w:trPr>
+        <w:tc>
+          <w:tcPr>
+            <w:tcW w:type="dxa" w:w="1800"/>
+          </w:tcPr>
+          <w:p>
+            <w:pPr>
+              <w:spacing w:after="0"/>
+            </w:pPr>
+            <w:r>
+              <w:rPr>
+                <w:rFonts w:ascii="Calibri" w:hAnsi="Calibri"/>
+                <w:color w:val="122033"/>
+                <w:sz w:val="19"/>
+              </w:rPr>
+              <w:t>Stale</w:t>
+            </w:r>
+          </w:p>
+        </w:tc>
+        <w:tc>
+          <w:tcPr>
+            <w:tcW w:type="dxa" w:w="7560"/>
+          </w:tcPr>
+          <w:p>
+            <w:pPr>
+              <w:spacing w:after="0"/>
+            </w:pPr>
+            <w:r>
+              <w:rPr>
+                <w:rFonts w:ascii="Calibri" w:hAnsi="Calibri"/>
+                <w:color w:val="122033"/>
+                <w:sz w:val="19"/>
+              </w:rPr>
+              <w:t>The matched last-modified date is blank or unusable, or is before the same calendar date one year prior to publication.</w:t>
+            </w:r>
+          </w:p>
+        </w:tc>
+      </w:tr>
+      <w:tr>
+        <w:trPr>
+          <w:cantSplit/>
+        </w:trPr>
+        <w:tc>
+          <w:tcPr>
+            <w:tcW w:type="dxa" w:w="1800"/>
+          </w:tcPr>
+          <w:p>
+            <w:pPr>
+              <w:spacing w:after="0"/>
+            </w:pPr>
+            <w:r>
+              <w:rPr>
+                <w:rFonts w:ascii="Calibri" w:hAnsi="Calibri"/>
+                <w:color w:val="122033"/>
+                <w:sz w:val="19"/>
+              </w:rPr>
+              <w:t>n/a</w:t>
+            </w:r>
+          </w:p>
+        </w:tc>
+        <w:tc>
+          <w:tcPr>
+            <w:tcW w:type="dxa" w:w="7560"/>
+          </w:tcPr>
+          <w:p>
+            <w:pPr>
+              <w:spacing w:after="0"/>
+            </w:pPr>
+            <w:r>
+              <w:rPr>
+                <w:rFonts w:ascii="Calibri" w:hAnsi="Calibri"/>
+                <w:color w:val="122033"/>
+                <w:sz w:val="19"/>
+              </w:rPr>
+              <w:t>No PIN record was matched to the unit. This does not mean inactive or stale.</w:t>
+            </w:r>
+          </w:p>
+        </w:tc>
+      </w:tr>
+    </w:tbl>
+    <w:p>
+      <w:pPr>
+        <w:spacing w:after="80"/>
+      </w:pPr>
+    </w:p>
+    <w:tbl>
+      <w:tblPr>
+        <w:tblW w:type="dxa" w:w="9360"/>
+        <w:jc w:val="left"/>
+        <w:tblLook w:firstColumn="1" w:firstRow="1" w:lastColumn="0" w:lastRow="0" w:noHBand="0" w:noVBand="1" w:val="04A0"/>
+        <w:tblInd w:w="120" w:type="dxa"/>
+        <w:tblBorders>
+          <w:top w:val="single" w:sz="4" w:space="0" w:color="D8E0EA"/>
+          <w:left w:val="single" w:sz="4" w:space="0" w:color="D8E0EA"/>
+          <w:bottom w:val="single" w:sz="4" w:space="0" w:color="D8E0EA"/>
+          <w:right w:val="single" w:sz="4" w:space="0" w:color="D8E0EA"/>
+          <w:insideH w:val="single" w:sz="4" w:space="0" w:color="D8E0EA"/>
+          <w:insideV w:val="single" w:sz="4" w:space="0" w:color="D8E0EA"/>
+        </w:tblBorders>
+      </w:tblPr>
+      <w:tblGrid>
+        <w:gridCol w:w="9360"/>
+      </w:tblGrid>
+      <w:tr>
+        <w:trPr>
+          <w:cantSplit/>
+        </w:trPr>
+        <w:tc>
+          <w:tcPr>
+            <w:tcW w:type="dxa" w:w="9360"/>
+            <w:tcMar>
+              <w:top w:w="80" w:type="dxa"/>
+              <w:start w:w="120" w:type="dxa"/>
+              <w:bottom w:w="80" w:type="dxa"/>
+              <w:end w:w="120" w:type="dxa"/>
+            </w:tcMar>
+            <w:vAlign w:val="center"/>
+            <w:shd w:fill="F4F6F9"/>
+          </w:tcPr>
+          <w:p>
+            <w:pPr>
+              <w:spacing w:after="60"/>
+            </w:pPr>
+            <w:r>
+              <w:rPr>
+                <w:rFonts w:ascii="Calibri" w:hAnsi="Calibri"/>
+                <w:b/>
+                <w:color w:val="1F4D78"/>
+                <w:sz w:val="21"/>
+              </w:rPr>
+              <w:t>How the funnel percentage works</w:t>
+            </w:r>
+          </w:p>
+          <w:p>
+            <w:pPr>
+              <w:spacing w:after="0"/>
+            </w:pPr>
+            <w:r>
+              <w:rPr>
+                <w:rFonts w:ascii="Calibri" w:hAnsi="Calibri"/>
+                <w:color w:val="122033"/>
+                <w:sz w:val="21"/>
+              </w:rPr>
+              <w:t>Inactive + Stale is the matched follow-up count. The percentage divides that count by all tracked membership-dashboard units in the selected program view. Units without a matched PIN stay in the denominator, so do not divide only by the number of PIN-status rows.</w:t>
+            </w:r>
+          </w:p>
+        </w:tc>
+      </w:tr>
+    </w:tbl>
+    <w:p>
+      <w:pPr>
+        <w:spacing w:after="40"/>
+      </w:pPr>
+    </w:p>
+    <w:p>
+      <w:pPr>
         <w:pStyle w:val="Heading1"/>
       </w:pPr>
       <w:r>
@@ -4600,7 +4934,7 @@
       <w:pPr>
         <w:pStyle w:val="ListBullet"/>
         <w:keepNext w:val="0"/>
-        <w:keepLines/>
+        <w:keepLines w:val="0"/>
         <w:spacing w:before="20" w:after="80"/>
       </w:pPr>
       <w:r>
@@ -4611,7 +4945,7 @@
       <w:pPr>
         <w:pStyle w:val="ListBullet"/>
         <w:keepNext w:val="0"/>
-        <w:keepLines/>
+        <w:keepLines w:val="0"/>
         <w:spacing w:before="20" w:after="80"/>
       </w:pPr>
       <w:r>
@@ -4622,7 +4956,7 @@
       <w:pPr>
         <w:pStyle w:val="ListBullet"/>
         <w:keepNext w:val="0"/>
-        <w:keepLines/>
+        <w:keepLines w:val="0"/>
         <w:spacing w:before="20" w:after="80"/>
       </w:pPr>
       <w:r>
@@ -4633,7 +4967,7 @@
       <w:pPr>
         <w:pStyle w:val="ListBullet"/>
         <w:keepNext w:val="0"/>
-        <w:keepLines/>
+        <w:keepLines w:val="0"/>
         <w:spacing w:before="20" w:after="80"/>
       </w:pPr>
       <w:r>
@@ -5749,7 +6083,7 @@
       <w:pPr>
         <w:pStyle w:val="ListBullet"/>
         <w:keepNext w:val="0"/>
-        <w:keepLines/>
+        <w:keepLines w:val="0"/>
         <w:spacing w:before="20" w:after="80"/>
       </w:pPr>
       <w:r>
@@ -5760,7 +6094,7 @@
       <w:pPr>
         <w:pStyle w:val="ListBullet"/>
         <w:keepNext w:val="0"/>
-        <w:keepLines/>
+        <w:keepLines w:val="0"/>
         <w:spacing w:before="20" w:after="80"/>
       </w:pPr>
       <w:r>
@@ -5771,7 +6105,7 @@
       <w:pPr>
         <w:pStyle w:val="ListBullet"/>
         <w:keepNext w:val="0"/>
-        <w:keepLines/>
+        <w:keepLines w:val="0"/>
         <w:spacing w:before="20" w:after="80"/>
       </w:pPr>
       <w:r>
@@ -5782,7 +6116,7 @@
       <w:pPr>
         <w:pStyle w:val="ListBullet"/>
         <w:keepNext w:val="0"/>
-        <w:keepLines/>
+        <w:keepLines w:val="0"/>
         <w:spacing w:before="20" w:after="80"/>
       </w:pPr>
       <w:r>
@@ -5793,7 +6127,7 @@
       <w:pPr>
         <w:pStyle w:val="ListBullet"/>
         <w:keepNext w:val="0"/>
-        <w:keepLines/>
+        <w:keepLines w:val="0"/>
         <w:spacing w:before="20" w:after="80"/>
       </w:pPr>
       <w:r>
@@ -7816,159 +8150,281 @@
         <w:t>12. Practical Caveats</w:t>
       </w:r>
     </w:p>
+    <w:tbl>
+      <w:tblPr>
+        <w:tblW w:type="dxa" w:w="9360"/>
+        <w:jc w:val="left"/>
+        <w:tblLook w:firstColumn="1" w:firstRow="1" w:lastColumn="0" w:lastRow="0" w:noHBand="0" w:noVBand="1" w:val="04A0"/>
+        <w:tblInd w:w="120" w:type="dxa"/>
+        <w:tblBorders>
+          <w:top w:val="single" w:sz="4" w:space="0" w:color="D8E0EA"/>
+          <w:left w:val="single" w:sz="4" w:space="0" w:color="D8E0EA"/>
+          <w:bottom w:val="single" w:sz="4" w:space="0" w:color="D8E0EA"/>
+          <w:right w:val="single" w:sz="4" w:space="0" w:color="D8E0EA"/>
+          <w:insideH w:val="single" w:sz="4" w:space="0" w:color="D8E0EA"/>
+          <w:insideV w:val="single" w:sz="4" w:space="0" w:color="D8E0EA"/>
+        </w:tblBorders>
+      </w:tblPr>
+      <w:tblGrid>
+        <w:gridCol w:w="9360"/>
+      </w:tblGrid>
+      <w:tr>
+        <w:trPr>
+          <w:cantSplit/>
+        </w:trPr>
+        <w:tc>
+          <w:tcPr>
+            <w:tcW w:type="dxa" w:w="9360"/>
+            <w:tcMar>
+              <w:top w:w="80" w:type="dxa"/>
+              <w:start w:w="120" w:type="dxa"/>
+              <w:bottom w:w="80" w:type="dxa"/>
+              <w:end w:w="120" w:type="dxa"/>
+            </w:tcMar>
+            <w:vAlign w:val="center"/>
+            <w:shd w:fill="F4F6F9"/>
+          </w:tcPr>
+          <w:p>
+            <w:pPr>
+              <w:spacing w:after="60"/>
+            </w:pPr>
+            <w:r>
+              <w:rPr>
+                <w:rFonts w:ascii="Calibri" w:hAnsi="Calibri"/>
+                <w:b/>
+                <w:color w:val="1F4D78"/>
+                <w:sz w:val="21"/>
+              </w:rPr>
+              <w:t>Freshness and source structure</w:t>
+            </w:r>
+          </w:p>
+          <w:p>
+            <w:pPr>
+              <w:spacing w:after="0"/>
+            </w:pPr>
+            <w:r>
+              <w:rPr>
+                <w:rFonts w:ascii="Calibri" w:hAnsi="Calibri"/>
+                <w:color w:val="122033"/>
+                <w:sz w:val="21"/>
+              </w:rPr>
+              <w:t>The dashboard is only as current as the most recent successful refresh and GitHub Pages deployment. Freshness times display in the viewer's local timezone. Workbook labels and sheet names matter; a source-structure change can require a code update. The website's ? controls give quick panel context, while the Markdown data dictionary remains the exact formula reference.</w:t>
+            </w:r>
+          </w:p>
+        </w:tc>
+      </w:tr>
+    </w:tbl>
     <w:p>
       <w:pPr>
-        <w:pStyle w:val="ListBullet"/>
-        <w:keepNext w:val="0"/>
-        <w:keepLines/>
-        <w:spacing w:before="20" w:after="80"/>
+        <w:spacing w:after="40"/>
       </w:pPr>
-      <w:r>
-        <w:t>The published dashboard is only as current as the most recent successful local refresh and GitHub Pages deployment.</w:t>
-      </w:r>
     </w:p>
+    <w:tbl>
+      <w:tblPr>
+        <w:tblW w:type="dxa" w:w="9360"/>
+        <w:jc w:val="left"/>
+        <w:tblLook w:firstColumn="1" w:firstRow="1" w:lastColumn="0" w:lastRow="0" w:noHBand="0" w:noVBand="1" w:val="04A0"/>
+        <w:tblInd w:w="120" w:type="dxa"/>
+        <w:tblBorders>
+          <w:top w:val="single" w:sz="4" w:space="0" w:color="D8E0EA"/>
+          <w:left w:val="single" w:sz="4" w:space="0" w:color="D8E0EA"/>
+          <w:bottom w:val="single" w:sz="4" w:space="0" w:color="D8E0EA"/>
+          <w:right w:val="single" w:sz="4" w:space="0" w:color="D8E0EA"/>
+          <w:insideH w:val="single" w:sz="4" w:space="0" w:color="D8E0EA"/>
+          <w:insideV w:val="single" w:sz="4" w:space="0" w:color="D8E0EA"/>
+        </w:tblBorders>
+      </w:tblPr>
+      <w:tblGrid>
+        <w:gridCol w:w="9360"/>
+      </w:tblGrid>
+      <w:tr>
+        <w:trPr>
+          <w:cantSplit/>
+        </w:trPr>
+        <w:tc>
+          <w:tcPr>
+            <w:tcW w:type="dxa" w:w="9360"/>
+            <w:tcMar>
+              <w:top w:w="80" w:type="dxa"/>
+              <w:start w:w="120" w:type="dxa"/>
+              <w:bottom w:w="80" w:type="dxa"/>
+              <w:end w:w="120" w:type="dxa"/>
+            </w:tcMar>
+            <w:vAlign w:val="center"/>
+            <w:shd w:fill="F4F6F9"/>
+          </w:tcPr>
+          <w:p>
+            <w:pPr>
+              <w:spacing w:after="60"/>
+            </w:pPr>
+            <w:r>
+              <w:rPr>
+                <w:rFonts w:ascii="Calibri" w:hAnsi="Calibri"/>
+                <w:b/>
+                <w:color w:val="1F4D78"/>
+                <w:sz w:val="21"/>
+              </w:rPr>
+              <w:t>Training and camping readiness</w:t>
+            </w:r>
+          </w:p>
+          <w:p>
+            <w:pPr>
+              <w:spacing w:after="0"/>
+            </w:pPr>
+            <w:r>
+              <w:rPr>
+                <w:rFonts w:ascii="Calibri" w:hAnsi="Calibri"/>
+                <w:color w:val="122033"/>
+                <w:sz w:val="21"/>
+              </w:rPr>
+              <w:t>Training and SYT expiration checks use the viewer browser's current date. SYT applies to all leaders; Hazardous Weather, BALOO, and IOLS flags apply where role and unit type make them relevant. Pack and Troop Camping Readiness uses the published roster snapshot and does not confirm campout attendance or approval.</w:t>
+            </w:r>
+          </w:p>
+        </w:tc>
+      </w:tr>
+    </w:tbl>
     <w:p>
       <w:pPr>
-        <w:pStyle w:val="ListBullet"/>
-        <w:keepNext w:val="0"/>
-        <w:keepLines/>
-        <w:spacing w:before="20" w:after="80"/>
+        <w:spacing w:after="40"/>
       </w:pPr>
-      <w:r>
-        <w:t>The ? buttons provide quick panel context in the website. They are not a replacement for this guide or the Markdown data dictionary.</w:t>
-      </w:r>
     </w:p>
+    <w:tbl>
+      <w:tblPr>
+        <w:tblW w:type="dxa" w:w="9360"/>
+        <w:jc w:val="left"/>
+        <w:tblLook w:firstColumn="1" w:firstRow="1" w:lastColumn="0" w:lastRow="0" w:noHBand="0" w:noVBand="1" w:val="04A0"/>
+        <w:tblInd w:w="120" w:type="dxa"/>
+        <w:tblBorders>
+          <w:top w:val="single" w:sz="4" w:space="0" w:color="D8E0EA"/>
+          <w:left w:val="single" w:sz="4" w:space="0" w:color="D8E0EA"/>
+          <w:bottom w:val="single" w:sz="4" w:space="0" w:color="D8E0EA"/>
+          <w:right w:val="single" w:sz="4" w:space="0" w:color="D8E0EA"/>
+          <w:insideH w:val="single" w:sz="4" w:space="0" w:color="D8E0EA"/>
+          <w:insideV w:val="single" w:sz="4" w:space="0" w:color="D8E0EA"/>
+        </w:tblBorders>
+      </w:tblPr>
+      <w:tblGrid>
+        <w:gridCol w:w="9360"/>
+      </w:tblGrid>
+      <w:tr>
+        <w:trPr>
+          <w:cantSplit/>
+        </w:trPr>
+        <w:tc>
+          <w:tcPr>
+            <w:tcW w:type="dxa" w:w="9360"/>
+            <w:tcMar>
+              <w:top w:w="80" w:type="dxa"/>
+              <w:start w:w="120" w:type="dxa"/>
+              <w:bottom w:w="80" w:type="dxa"/>
+              <w:end w:w="120" w:type="dxa"/>
+            </w:tcMar>
+            <w:vAlign w:val="center"/>
+            <w:shd w:fill="F4F6F9"/>
+          </w:tcPr>
+          <w:p>
+            <w:pPr>
+              <w:spacing w:after="60"/>
+            </w:pPr>
+            <w:r>
+              <w:rPr>
+                <w:rFonts w:ascii="Calibri" w:hAnsi="Calibri"/>
+                <w:b/>
+                <w:color w:val="1F4D78"/>
+                <w:sz w:val="21"/>
+              </w:rPr>
+              <w:t>Service Area, TAY, and Popcorn interpretation</w:t>
+            </w:r>
+          </w:p>
+          <w:p>
+            <w:pPr>
+              <w:spacing w:after="0"/>
+            </w:pPr>
+            <w:r>
+              <w:rPr>
+                <w:rFonts w:ascii="Calibri" w:hAnsi="Calibri"/>
+                <w:color w:val="122033"/>
+                <w:sz w:val="21"/>
+              </w:rPr>
+              <w:t>Official district charts exclude non-official monday.com labels. Service Area filters and district leadership use the run-specific Service Areas capture rather than workbook columns. Program TAY values are overlapping estimates and must not be added together. Popcorn participation counts all published unit rows in the denominator and only Committed rows in the numerator.</w:t>
+            </w:r>
+          </w:p>
+        </w:tc>
+      </w:tr>
+    </w:tbl>
     <w:p>
       <w:pPr>
-        <w:pStyle w:val="ListBullet"/>
-        <w:keepNext w:val="0"/>
-        <w:keepLines/>
-        <w:spacing w:before="20" w:after="80"/>
+        <w:spacing w:after="40"/>
       </w:pPr>
-      <w:r>
-        <w:t>Workbook labels and sheet names matter. If a source workbook changes structure, the refresh may need a code update.</w:t>
-      </w:r>
     </w:p>
+    <w:tbl>
+      <w:tblPr>
+        <w:tblW w:type="dxa" w:w="9360"/>
+        <w:jc w:val="left"/>
+        <w:tblLook w:firstColumn="1" w:firstRow="1" w:lastColumn="0" w:lastRow="0" w:noHBand="0" w:noVBand="1" w:val="04A0"/>
+        <w:tblInd w:w="120" w:type="dxa"/>
+        <w:tblBorders>
+          <w:top w:val="single" w:sz="4" w:space="0" w:color="D8E0EA"/>
+          <w:left w:val="single" w:sz="4" w:space="0" w:color="D8E0EA"/>
+          <w:bottom w:val="single" w:sz="4" w:space="0" w:color="D8E0EA"/>
+          <w:right w:val="single" w:sz="4" w:space="0" w:color="D8E0EA"/>
+          <w:insideH w:val="single" w:sz="4" w:space="0" w:color="D8E0EA"/>
+          <w:insideV w:val="single" w:sz="4" w:space="0" w:color="D8E0EA"/>
+        </w:tblBorders>
+      </w:tblPr>
+      <w:tblGrid>
+        <w:gridCol w:w="9360"/>
+      </w:tblGrid>
+      <w:tr>
+        <w:trPr>
+          <w:cantSplit/>
+        </w:trPr>
+        <w:tc>
+          <w:tcPr>
+            <w:tcW w:type="dxa" w:w="9360"/>
+            <w:tcMar>
+              <w:top w:w="80" w:type="dxa"/>
+              <w:start w:w="120" w:type="dxa"/>
+              <w:bottom w:w="80" w:type="dxa"/>
+              <w:end w:w="120" w:type="dxa"/>
+            </w:tcMar>
+            <w:vAlign w:val="center"/>
+            <w:shd w:fill="F4F6F9"/>
+          </w:tcPr>
+          <w:p>
+            <w:pPr>
+              <w:spacing w:after="60"/>
+            </w:pPr>
+            <w:r>
+              <w:rPr>
+                <w:rFonts w:ascii="Calibri" w:hAnsi="Calibri"/>
+                <w:b/>
+                <w:color w:val="1F4D78"/>
+                <w:sz w:val="21"/>
+              </w:rPr>
+              <w:t>Public-data privacy</w:t>
+            </w:r>
+          </w:p>
+          <w:p>
+            <w:pPr>
+              <w:spacing w:after="0"/>
+            </w:pPr>
+            <w:r>
+              <w:rPr>
+                <w:rFonts w:ascii="Calibri" w:hAnsi="Calibri"/>
+                <w:color w:val="122033"/>
+                <w:sz w:val="21"/>
+              </w:rPr>
+              <w:t>Popcorn contacts are excluded from public JSON. Across the Council Summary and Commissioner outputs, person names display as first name plus last initial, and publication stops if a covered full name remains.</w:t>
+            </w:r>
+          </w:p>
+        </w:tc>
+      </w:tr>
+    </w:tbl>
     <w:p>
       <w:pPr>
-        <w:pStyle w:val="ListBullet"/>
-        <w:keepNext w:val="0"/>
-        <w:keepLines/>
-        <w:spacing w:before="20" w:after="80"/>
+        <w:spacing w:after="40"/>
       </w:pPr>
-      <w:r>
-        <w:t>Expiration checks on the Training and SYT pages use the viewer browser's current date.</w:t>
-      </w:r>
-    </w:p>
-    <w:p>
-      <w:pPr>
-        <w:pStyle w:val="ListBullet"/>
-        <w:keepNext w:val="0"/>
-        <w:keepLines/>
-        <w:spacing w:before="20" w:after="80"/>
-      </w:pPr>
-      <w:r>
-        <w:t>Freshness timestamps are displayed in the viewer browser's local timezone, so the same data snapshot can show different clock times to viewers in different timezones.</w:t>
-      </w:r>
-    </w:p>
-    <w:p>
-      <w:pPr>
-        <w:pStyle w:val="ListBullet"/>
-        <w:keepNext w:val="0"/>
-        <w:keepLines/>
-        <w:spacing w:before="20" w:after="80"/>
-      </w:pPr>
-      <w:r>
-        <w:t>The SYT detail page flags SYT for all leaders. It flags Hazardous Weather, BALOO, and IOLS only when they are required by the leader's role and unit type.</w:t>
-      </w:r>
-    </w:p>
-    <w:p>
-      <w:pPr>
-        <w:pStyle w:val="ListBullet"/>
-        <w:keepNext w:val="0"/>
-        <w:keepLines/>
-        <w:spacing w:before="20" w:after="80"/>
-      </w:pPr>
-      <w:r>
-        <w:t>The Pack and Troop Camping Readiness pages evaluate roster-level training signals from the published snapshot; they do not confirm campout attendance or approval.</w:t>
-      </w:r>
-    </w:p>
-    <w:p>
-      <w:pPr>
-        <w:pStyle w:val="ListBullet"/>
-        <w:keepNext w:val="0"/>
-        <w:keepLines/>
-        <w:spacing w:before="20" w:after="80"/>
-      </w:pPr>
-      <w:r>
-        <w:t>monday.com district labels can include operational labels that are not official dashboard districts; official district charts filter those out.</w:t>
-      </w:r>
-    </w:p>
-    <w:p>
-      <w:pPr>
-        <w:pStyle w:val="ListBullet"/>
-        <w:keepNext w:val="0"/>
-        <w:keepLines/>
-        <w:spacing w:before="20" w:after="80"/>
-      </w:pPr>
-      <w:r>
-        <w:t>Service Area filters and district leadership are based on the run-specific monday.com Service Areas capture, not on source workbook columns.</w:t>
-      </w:r>
-    </w:p>
-    <w:p>
-      <w:pPr>
-        <w:pStyle w:val="ListBullet"/>
-        <w:keepNext w:val="0"/>
-        <w:keepLines/>
-        <w:spacing w:before="20" w:after="80"/>
-      </w:pPr>
-      <w:r>
-        <w:t>Program TAY values are dashboard estimates based on published school grade or age spans and must not be added together.</w:t>
-      </w:r>
-    </w:p>
-    <w:p>
-      <w:pPr>
-        <w:pStyle w:val="ListBullet"/>
-        <w:keepNext w:val="0"/>
-        <w:keepLines/>
-        <w:spacing w:before="20" w:after="80"/>
-      </w:pPr>
-      <w:r>
-        <w:t>Popcorn participation counts every published unit row in the denominator and only rows marked Committed in the numerator.</w:t>
-      </w:r>
-    </w:p>
-    <w:p>
-      <w:pPr>
-        <w:pStyle w:val="ListBullet"/>
-        <w:keepNext w:val="0"/>
-        <w:keepLines/>
-        <w:spacing w:before="20" w:after="80"/>
-      </w:pPr>
-      <w:r>
-        <w:t>Popcorn contact names, email addresses, and phone numbers are excluded from the public JSON and dashboard.</w:t>
-      </w:r>
-    </w:p>
-    <w:p>
-      <w:pPr>
-        <w:pStyle w:val="ListBullet"/>
-        <w:keepNext w:val="0"/>
-        <w:keepLines/>
-        <w:spacing w:before="20" w:after="80"/>
-      </w:pPr>
-      <w:r>
-        <w:t>Across all public Council Summary and Commissioner outputs, person names display as first name plus last initial. The publication gate stops deployment if a covered full name remains.</w:t>
-      </w:r>
-    </w:p>
-    <w:p>
-      <w:pPr>
-        <w:pStyle w:val="ListBullet"/>
-        <w:keepNext w:val="0"/>
-        <w:keepLines/>
-        <w:spacing w:before="20" w:after="80"/>
-      </w:pPr>
-      <w:r>
-        <w:t>The Markdown data dictionary remains the best place for exact formulas and implementation details.</w:t>
-      </w:r>
     </w:p>
     <w:p>
       <w:pPr>
@@ -8790,7 +9246,7 @@
                 <w:color w:val="122033"/>
                 <w:sz w:val="19"/>
               </w:rPr>
-              <w:t>Stale when a matched BeAScout PIN last-modified date is blank or earlier than the same calendar date one year before publication; otherwise retain Active or Inactive.</w:t>
+              <w:t>Stale when a matched BeAScout PIN last-modified date is blank or unusable, or earlier than the same calendar date one year before publication; otherwise retain Active or Inactive. No match displays n/a.</w:t>
             </w:r>
           </w:p>
         </w:tc>
@@ -8831,7 +9287,7 @@
                 <w:color w:val="122033"/>
                 <w:sz w:val="19"/>
               </w:rPr>
-              <w:t>Count of PIN rows in either Inactive or Stale state, divided by all units in the current master program view for the funnel percentage.</w:t>
+              <w:t>Count of matched PIN rows in either Inactive or Stale state, divided by all tracked membership-dashboard units in the current master program view; unmatched units remain in the denominator.</w:t>
             </w:r>
           </w:p>
         </w:tc>

</xml_diff>

<commit_message>
Clarify PIN freshness wording
</commit_message>
<xml_diff>
--- a/docs/Council-Dashboard-Summary-Source-and-Calculation-Guide.docx
+++ b/docs/Council-Dashboard-Summary-Source-and-Calculation-Guide.docx
@@ -3931,7 +3931,7 @@
                 <w:color w:val="122033"/>
                 <w:sz w:val="19"/>
               </w:rPr>
-              <w:t>The matched last-modified date is blank or unusable, or is before the same calendar date one year prior to publication.</w:t>
+              <w:t>More than 12 months have passed since the matched PIN's last update, or its update date is blank or unusable.</w:t>
             </w:r>
           </w:p>
         </w:tc>
@@ -9246,7 +9246,7 @@
                 <w:color w:val="122033"/>
                 <w:sz w:val="19"/>
               </w:rPr>
-              <w:t>Stale when a matched BeAScout PIN last-modified date is blank or unusable, or earlier than the same calendar date one year before publication; otherwise retain Active or Inactive. No match displays n/a.</w:t>
+              <w:t>Stale when more than 12 months have passed since a matched BeAScout PIN's last update, or its update date is blank or unusable; otherwise retain Active or Inactive. No match displays n/a.</w:t>
             </w:r>
           </w:p>
         </w:tc>

</xml_diff>

<commit_message>
Add District Scorecard PIN currency
</commit_message>
<xml_diff>
--- a/docs/Council-Dashboard-Summary-Source-and-Calculation-Guide.docx
+++ b/docs/Council-Dashboard-Summary-Source-and-Calculation-Guide.docx
@@ -365,7 +365,7 @@
                 <w:color w:val="122033"/>
                 <w:sz w:val="19"/>
               </w:rPr>
-              <w:t>Aug 31, 2026</w:t>
+              <w:t>Sep 1, 2026</w:t>
             </w:r>
           </w:p>
         </w:tc>
@@ -3731,7 +3731,7 @@
         <w:pStyle w:val="BodyText"/>
       </w:pPr>
       <w:r>
-        <w:t>The dashboard uses one PIN classification in Unit Follow-up, the first Unit-Level Detail KPI, and the Unit Health Funnel. It does not treat a missing match as an inactive PIN.</w:t>
+        <w:t>The dashboard uses one PIN classification in Unit Follow-up, the first Unit-Level Detail KPI, the Unit Health Funnel, and the District Performance scorecard. It does not treat a missing match as an inactive PIN.</w:t>
       </w:r>
     </w:p>
     <w:tbl>
@@ -4257,7 +4257,7 @@
                 <w:color w:val="122033"/>
                 <w:sz w:val="19"/>
               </w:rPr>
-              <w:t>Which districts lead or lag across membership, unit health, training, SYT, and commissioner coverage.</w:t>
+              <w:t>Which districts lead or lag across membership, unit health, PIN currency, training, SYT, and commissioner coverage.</w:t>
             </w:r>
           </w:p>
         </w:tc>
@@ -9247,6 +9247,47 @@
                 <w:sz w:val="19"/>
               </w:rPr>
               <w:t>Stale when more than 12 months have passed since a matched BeAScout PIN's last update, or its update date is blank or unusable; otherwise retain Active or Inactive. No match displays n/a.</w:t>
+            </w:r>
+          </w:p>
+        </w:tc>
+      </w:tr>
+      <w:tr>
+        <w:trPr>
+          <w:cantSplit/>
+        </w:trPr>
+        <w:tc>
+          <w:tcPr>
+            <w:tcW w:type="dxa" w:w="2700"/>
+          </w:tcPr>
+          <w:p>
+            <w:pPr>
+              <w:spacing w:after="0"/>
+            </w:pPr>
+            <w:r>
+              <w:rPr>
+                <w:rFonts w:ascii="Calibri" w:hAnsi="Calibri"/>
+                <w:color w:val="122033"/>
+                <w:sz w:val="19"/>
+              </w:rPr>
+              <w:t>PIN Currency</w:t>
+            </w:r>
+          </w:p>
+        </w:tc>
+        <w:tc>
+          <w:tcPr>
+            <w:tcW w:type="dxa" w:w="6660"/>
+          </w:tcPr>
+          <w:p>
+            <w:pPr>
+              <w:spacing w:after="0"/>
+            </w:pPr>
+            <w:r>
+              <w:rPr>
+                <w:rFonts w:ascii="Calibri" w:hAnsi="Calibri"/>
+                <w:color w:val="122033"/>
+                <w:sz w:val="19"/>
+              </w:rPr>
+              <w:t>Matched PIN rows in current Active or Inactive display states divided by all tracked units in the selected district/program view; Stale and unmatched n/a units remain in the denominator and do not count as current.</w:t>
             </w:r>
           </w:p>
         </w:tc>

</xml_diff>

<commit_message>
Add PIN Status and Completeness page
</commit_message>
<xml_diff>
--- a/docs/Council-Dashboard-Summary-Source-and-Calculation-Guide.docx
+++ b/docs/Council-Dashboard-Summary-Source-and-Calculation-Guide.docx
@@ -201,7 +201,7 @@
                 <w:color w:val="122033"/>
                 <w:sz w:val="19"/>
               </w:rPr>
-              <w:t>Aug 31, 2026</w:t>
+              <w:t>Sep 1, 2026</w:t>
             </w:r>
           </w:p>
         </w:tc>
@@ -324,7 +324,7 @@
                 <w:color w:val="122033"/>
                 <w:sz w:val="19"/>
               </w:rPr>
-              <w:t>2026-08-31_Membership-Hub-Field-Service-monday-export.xlsx</w:t>
+              <w:t>2026-08-23_Membership-Hub-Field-Service-monday-export.xlsx</w:t>
             </w:r>
           </w:p>
         </w:tc>
@@ -1056,7 +1056,7 @@
                 <w:color w:val="122033"/>
                 <w:sz w:val="19"/>
               </w:rPr>
-              <w:t>205</w:t>
+              <w:t>208</w:t>
             </w:r>
           </w:p>
         </w:tc>
@@ -1220,7 +1220,7 @@
                 <w:color w:val="122033"/>
                 <w:sz w:val="19"/>
               </w:rPr>
-              <w:t>98 (34.9%)</w:t>
+              <w:t>92 (32.7%)</w:t>
             </w:r>
           </w:p>
         </w:tc>
@@ -4052,6 +4052,75 @@
         <w:spacing w:after="40"/>
       </w:pPr>
     </w:p>
+    <w:tbl>
+      <w:tblPr>
+        <w:tblW w:type="dxa" w:w="9360"/>
+        <w:jc w:val="left"/>
+        <w:tblLook w:firstColumn="1" w:firstRow="1" w:lastColumn="0" w:lastRow="0" w:noHBand="0" w:noVBand="1" w:val="04A0"/>
+        <w:tblInd w:w="120" w:type="dxa"/>
+        <w:tblBorders>
+          <w:top w:val="single" w:sz="4" w:space="0" w:color="D8E0EA"/>
+          <w:left w:val="single" w:sz="4" w:space="0" w:color="D8E0EA"/>
+          <w:bottom w:val="single" w:sz="4" w:space="0" w:color="D8E0EA"/>
+          <w:right w:val="single" w:sz="4" w:space="0" w:color="D8E0EA"/>
+          <w:insideH w:val="single" w:sz="4" w:space="0" w:color="D8E0EA"/>
+          <w:insideV w:val="single" w:sz="4" w:space="0" w:color="D8E0EA"/>
+        </w:tblBorders>
+      </w:tblPr>
+      <w:tblGrid>
+        <w:gridCol w:w="9360"/>
+      </w:tblGrid>
+      <w:tr>
+        <w:trPr>
+          <w:cantSplit/>
+        </w:trPr>
+        <w:tc>
+          <w:tcPr>
+            <w:tcW w:type="dxa" w:w="9360"/>
+            <w:tcMar>
+              <w:top w:w="80" w:type="dxa"/>
+              <w:start w:w="120" w:type="dxa"/>
+              <w:bottom w:w="80" w:type="dxa"/>
+              <w:end w:w="120" w:type="dxa"/>
+            </w:tcMar>
+            <w:vAlign w:val="center"/>
+            <w:shd w:fill="F4F6F9"/>
+          </w:tcPr>
+          <w:p>
+            <w:pPr>
+              <w:spacing w:after="60"/>
+            </w:pPr>
+            <w:r>
+              <w:rPr>
+                <w:rFonts w:ascii="Calibri" w:hAnsi="Calibri"/>
+                <w:b/>
+                <w:color w:val="1F4D78"/>
+                <w:sz w:val="21"/>
+              </w:rPr>
+              <w:t>Required PIN Details is separate from freshness</w:t>
+            </w:r>
+          </w:p>
+          <w:p>
+            <w:pPr>
+              <w:spacing w:after="0"/>
+            </w:pPr>
+            <w:r>
+              <w:rPr>
+                <w:rFonts w:ascii="Calibri" w:hAnsi="Calibri"/>
+                <w:color w:val="122033"/>
+                <w:sz w:val="21"/>
+              </w:rPr>
+              <w:t>A matched PIN is complete when status, contact name plus either email or phone, meeting location, and meeting details are present. Website, fee, fundraising, and availability are not counted. Complete matched PINs are divided by all tracked units, including units without a matched PIN. The public data contains only completion flags, not contact or meeting values.</w:t>
+            </w:r>
+          </w:p>
+        </w:tc>
+      </w:tr>
+    </w:tbl>
+    <w:p>
+      <w:pPr>
+        <w:spacing w:after="40"/>
+      </w:pPr>
+    </w:p>
     <w:p>
       <w:pPr>
         <w:pStyle w:val="Heading1"/>
@@ -4258,6 +4327,47 @@
                 <w:sz w:val="19"/>
               </w:rPr>
               <w:t>Which districts lead or lag across membership, unit health, PIN currency, training, SYT, and commissioner coverage.</w:t>
+            </w:r>
+          </w:p>
+        </w:tc>
+      </w:tr>
+      <w:tr>
+        <w:trPr>
+          <w:cantSplit/>
+        </w:trPr>
+        <w:tc>
+          <w:tcPr>
+            <w:tcW w:type="dxa" w:w="2100"/>
+          </w:tcPr>
+          <w:p>
+            <w:pPr>
+              <w:spacing w:after="0"/>
+            </w:pPr>
+            <w:r>
+              <w:rPr>
+                <w:rFonts w:ascii="Calibri" w:hAnsi="Calibri"/>
+                <w:color w:val="122033"/>
+                <w:sz w:val="19"/>
+              </w:rPr>
+              <w:t>PIN Status &amp; Completeness</w:t>
+            </w:r>
+          </w:p>
+        </w:tc>
+        <w:tc>
+          <w:tcPr>
+            <w:tcW w:type="dxa" w:w="7260"/>
+          </w:tcPr>
+          <w:p>
+            <w:pPr>
+              <w:spacing w:after="0"/>
+            </w:pPr>
+            <w:r>
+              <w:rPr>
+                <w:rFonts w:ascii="Calibri" w:hAnsi="Calibri"/>
+                <w:color w:val="122033"/>
+                <w:sz w:val="19"/>
+              </w:rPr>
+              <w:t>Which districts need PIN freshness or essential contact-and-meeting detail follow-up, without publishing the private field values.</w:t>
             </w:r>
           </w:p>
         </w:tc>
@@ -9288,6 +9398,47 @@
                 <w:sz w:val="19"/>
               </w:rPr>
               <w:t>Matched PIN rows in current Active or Inactive display states divided by all tracked units in the selected district/program view; Stale and unmatched n/a units remain in the denominator and do not count as current.</w:t>
+            </w:r>
+          </w:p>
+        </w:tc>
+      </w:tr>
+      <w:tr>
+        <w:trPr>
+          <w:cantSplit/>
+        </w:trPr>
+        <w:tc>
+          <w:tcPr>
+            <w:tcW w:type="dxa" w:w="2700"/>
+          </w:tcPr>
+          <w:p>
+            <w:pPr>
+              <w:spacing w:after="0"/>
+            </w:pPr>
+            <w:r>
+              <w:rPr>
+                <w:rFonts w:ascii="Calibri" w:hAnsi="Calibri"/>
+                <w:color w:val="122033"/>
+                <w:sz w:val="19"/>
+              </w:rPr>
+              <w:t>Required PIN Details</w:t>
+            </w:r>
+          </w:p>
+        </w:tc>
+        <w:tc>
+          <w:tcPr>
+            <w:tcW w:type="dxa" w:w="6660"/>
+          </w:tcPr>
+          <w:p>
+            <w:pPr>
+              <w:spacing w:after="0"/>
+            </w:pPr>
+            <w:r>
+              <w:rPr>
+                <w:rFonts w:ascii="Calibri" w:hAnsi="Calibri"/>
+                <w:color w:val="122033"/>
+                <w:sz w:val="19"/>
+              </w:rPr>
+              <w:t>Matched PIN rows with status, contact name plus email or phone, meeting location, and meeting details divided by all tracked units. Unmatched units remain in the denominator; freshness is measured separately.</w:t>
             </w:r>
           </w:p>
         </w:tc>

</xml_diff>

<commit_message>
Add PIN state and completeness context
</commit_message>
<xml_diff>
--- a/docs/Council-Dashboard-Summary-Source-and-Calculation-Guide.docx
+++ b/docs/Council-Dashboard-Summary-Source-and-Calculation-Guide.docx
@@ -4244,7 +4244,7 @@
                 <w:color w:val="122033"/>
                 <w:sz w:val="19"/>
               </w:rPr>
-              <w:t>What the Council's current KPI picture is and which operating areas need attention first.</w:t>
+              <w:t>What the Council's current KPI picture is, including PIN state in Signals to Watch, and which operating areas need attention first. Explore links directly to PIN Status &amp; Completeness.</w:t>
             </w:r>
           </w:p>
         </w:tc>
@@ -4859,7 +4859,7 @@
                 <w:color w:val="122033"/>
                 <w:sz w:val="19"/>
               </w:rPr>
-              <w:t>Which individual units and members drive program-specific youth, growth, training, SYT, health, assignment, BeAScout PIN status, and Pack/Troop camping-readiness status.</w:t>
+              <w:t>Which individual units and members drive program-specific youth, growth, training, SYT, health, assignment, BeAScout PIN status, Required PIN Details in Commissioner Context, and Pack/Troop camping-readiness status.</w:t>
             </w:r>
           </w:p>
         </w:tc>

</xml_diff>

<commit_message>
Add expandable district PIN unit detail
</commit_message>
<xml_diff>
--- a/docs/Council-Dashboard-Summary-Source-and-Calculation-Guide.docx
+++ b/docs/Council-Dashboard-Summary-Source-and-Calculation-Guide.docx
@@ -201,7 +201,7 @@
                 <w:color w:val="122033"/>
                 <w:sz w:val="19"/>
               </w:rPr>
-              <w:t>Sep 1, 2026</w:t>
+              <w:t>Sep 2, 2026</w:t>
             </w:r>
           </w:p>
         </w:tc>
@@ -242,7 +242,7 @@
                 <w:color w:val="122033"/>
                 <w:sz w:val="19"/>
               </w:rPr>
-              <w:t>2026-08-31_Dashboard - CAC.xlsx</w:t>
+              <w:t>2026-09-02_Dashboard - CAC.xlsx</w:t>
             </w:r>
           </w:p>
         </w:tc>
@@ -283,7 +283,7 @@
                 <w:color w:val="122033"/>
                 <w:sz w:val="19"/>
               </w:rPr>
-              <w:t>2026-08-31_CST7.xlsx</w:t>
+              <w:t>2026-09-02_CST7.xlsx</w:t>
             </w:r>
           </w:p>
         </w:tc>
@@ -365,7 +365,7 @@
                 <w:color w:val="122033"/>
                 <w:sz w:val="19"/>
               </w:rPr>
-              <w:t>Sep 1, 2026</w:t>
+              <w:t>Sep 3, 2026</w:t>
             </w:r>
           </w:p>
         </w:tc>
@@ -646,7 +646,7 @@
                 <w:color w:val="122033"/>
                 <w:sz w:val="19"/>
               </w:rPr>
-              <w:t>8,309</w:t>
+              <w:t>8,400</w:t>
             </w:r>
           </w:p>
         </w:tc>
@@ -687,7 +687,7 @@
                 <w:color w:val="122033"/>
                 <w:sz w:val="19"/>
               </w:rPr>
-              <w:t>3,546</w:t>
+              <w:t>3,560</w:t>
             </w:r>
           </w:p>
         </w:tc>
@@ -728,7 +728,7 @@
                 <w:color w:val="122033"/>
                 <w:sz w:val="19"/>
               </w:rPr>
-              <w:t>65.3%</w:t>
+              <w:t>67.1%</w:t>
             </w:r>
           </w:p>
         </w:tc>
@@ -810,7 +810,7 @@
                 <w:color w:val="122033"/>
                 <w:sz w:val="19"/>
               </w:rPr>
-              <w:t>121 (40.7%)</w:t>
+              <w:t>120 (40.4%)</w:t>
             </w:r>
           </w:p>
         </w:tc>
@@ -4367,7 +4367,7 @@
                 <w:color w:val="122033"/>
                 <w:sz w:val="19"/>
               </w:rPr>
-              <w:t>Which districts need PIN freshness or essential contact-and-meeting detail follow-up, without publishing the private field values.</w:t>
+              <w:t>Which districts need PIN freshness or essential contact-and-meeting detail follow-up, with expandable district rows that identify individual unit status and missing categories without publishing private field values.</w:t>
             </w:r>
           </w:p>
         </w:tc>

</xml_diff>

<commit_message>
Add expandable District Operational Detail
</commit_message>
<xml_diff>
--- a/docs/Council-Dashboard-Summary-Source-and-Calculation-Guide.docx
+++ b/docs/Council-Dashboard-Summary-Source-and-Calculation-Guide.docx
@@ -201,7 +201,7 @@
                 <w:color w:val="122033"/>
                 <w:sz w:val="19"/>
               </w:rPr>
-              <w:t>Sep 2, 2026</w:t>
+              <w:t>Sep 3, 2026</w:t>
             </w:r>
           </w:p>
         </w:tc>
@@ -4326,7 +4326,7 @@
                 <w:color w:val="122033"/>
                 <w:sz w:val="19"/>
               </w:rPr>
-              <w:t>Which districts lead or lag across membership, unit health, PIN currency, training, SYT, and commissioner coverage.</w:t>
+              <w:t>Which districts lead or lag across membership, unit health, PIN currency, training, SYT, and commissioner coverage, with expandable district rows showing individual unit health and direct Unit-Level Detail links.</w:t>
             </w:r>
           </w:p>
         </w:tc>

</xml_diff>

<commit_message>
Add Unit Key 3 coverage page
</commit_message>
<xml_diff>
--- a/docs/Council-Dashboard-Summary-Source-and-Calculation-Guide.docx
+++ b/docs/Council-Dashboard-Summary-Source-and-Calculation-Guide.docx
@@ -201,7 +201,7 @@
                 <w:color w:val="122033"/>
                 <w:sz w:val="19"/>
               </w:rPr>
-              <w:t>Sep 3, 2026</w:t>
+              <w:t>Sep 6, 2026</w:t>
             </w:r>
           </w:p>
         </w:tc>
@@ -242,7 +242,7 @@
                 <w:color w:val="122033"/>
                 <w:sz w:val="19"/>
               </w:rPr>
-              <w:t>2026-09-02_Dashboard - CAC.xlsx</w:t>
+              <w:t>2026-09-06_Dashboard - CAC.xlsx</w:t>
             </w:r>
           </w:p>
         </w:tc>
@@ -283,7 +283,7 @@
                 <w:color w:val="122033"/>
                 <w:sz w:val="19"/>
               </w:rPr>
-              <w:t>2026-09-02_CST7.xlsx</w:t>
+              <w:t>2026-09-06_CST7.xlsx</w:t>
             </w:r>
           </w:p>
         </w:tc>
@@ -365,7 +365,7 @@
                 <w:color w:val="122033"/>
                 <w:sz w:val="19"/>
               </w:rPr>
-              <w:t>Sep 3, 2026</w:t>
+              <w:t>Sep 6, 2026</w:t>
             </w:r>
           </w:p>
         </w:tc>
@@ -646,7 +646,7 @@
                 <w:color w:val="122033"/>
                 <w:sz w:val="19"/>
               </w:rPr>
-              <w:t>8,400</w:t>
+              <w:t>8,541</w:t>
             </w:r>
           </w:p>
         </w:tc>
@@ -687,7 +687,7 @@
                 <w:color w:val="122033"/>
                 <w:sz w:val="19"/>
               </w:rPr>
-              <w:t>3,560</w:t>
+              <w:t>3,577</w:t>
             </w:r>
           </w:p>
         </w:tc>
@@ -810,7 +810,7 @@
                 <w:color w:val="122033"/>
                 <w:sz w:val="19"/>
               </w:rPr>
-              <w:t>120 (40.4%)</w:t>
+              <w:t>119 (40.1%)</w:t>
             </w:r>
           </w:p>
         </w:tc>
@@ -851,7 +851,7 @@
                 <w:color w:val="122033"/>
                 <w:sz w:val="19"/>
               </w:rPr>
-              <w:t>86 (29.0%)</w:t>
+              <w:t>92 (31.0%)</w:t>
             </w:r>
           </w:p>
         </w:tc>
@@ -1015,7 +1015,7 @@
                 <w:color w:val="122033"/>
                 <w:sz w:val="19"/>
               </w:rPr>
-              <w:t>5,759</w:t>
+              <w:t>5,811</w:t>
             </w:r>
           </w:p>
         </w:tc>
@@ -1780,7 +1780,7 @@
                 <w:color w:val="122033"/>
                 <w:sz w:val="21"/>
               </w:rPr>
-              <w:t>Every person-name field published on the public Council Summary and Commissioner sites is reduced to first name plus last initial, such as Alex R. This applies to training and SYT rows, commissioner rosters and assignments, Service Area and district leadership, Unit-Level members and commissioners, and Renewal owners, leaders, contacts, and commissioners. Private source workbooks and intermediate working files are unchanged.</w:t>
+              <w:t>Every person-name field published on the public Council Summary and Commissioner sites is reduced to first name plus last initial, such as Alex R. This applies to training and SYT rows, Unit Key 3 holders, commissioner rosters and assignments, Service Area and district leadership, Unit-Level members and commissioners, and Renewal owners, leaders, contacts, and commissioners. Private source workbooks and intermediate working files are unchanged.</w:t>
             </w:r>
           </w:p>
         </w:tc>
@@ -4449,7 +4449,7 @@
                 <w:color w:val="122033"/>
                 <w:sz w:val="19"/>
               </w:rPr>
-              <w:t>Where unit health, assignment, combined Inactive + Stale BeAScout PINs, and renewal follow-up require action.</w:t>
+              <w:t>Where unit health, assignment, combined Inactive + Stale BeAScout PINs, Unit Key 3 coverage, and renewal follow-up require action.</w:t>
             </w:r>
           </w:p>
         </w:tc>
@@ -4860,6 +4860,47 @@
                 <w:sz w:val="19"/>
               </w:rPr>
               <w:t>Which individual units and members drive program-specific youth, growth, training, SYT, health, assignment, BeAScout PIN status, Required PIN Details in Commissioner Context, and Pack/Troop camping-readiness status.</w:t>
+            </w:r>
+          </w:p>
+        </w:tc>
+      </w:tr>
+      <w:tr>
+        <w:trPr>
+          <w:cantSplit/>
+        </w:trPr>
+        <w:tc>
+          <w:tcPr>
+            <w:tcW w:type="dxa" w:w="2100"/>
+          </w:tcPr>
+          <w:p>
+            <w:pPr>
+              <w:spacing w:after="0"/>
+            </w:pPr>
+            <w:r>
+              <w:rPr>
+                <w:rFonts w:ascii="Calibri" w:hAnsi="Calibri"/>
+                <w:color w:val="122033"/>
+                <w:sz w:val="19"/>
+              </w:rPr>
+              <w:t>Unit Key 3 Coverage</w:t>
+            </w:r>
+          </w:p>
+        </w:tc>
+        <w:tc>
+          <w:tcPr>
+            <w:tcW w:type="dxa" w:w="7260"/>
+          </w:tcPr>
+          <w:p>
+            <w:pPr>
+              <w:spacing w:after="0"/>
+            </w:pPr>
+            <w:r>
+              <w:rPr>
+                <w:rFonts w:ascii="Calibri" w:hAnsi="Calibri"/>
+                <w:color w:val="122033"/>
+                <w:sz w:val="19"/>
+              </w:rPr>
+              <w:t>Which units have current Unit Leader, Committee Chair, and COR/CUR coverage, which positions are missing, and how completion compares by unit type. Either a current COR or CUR satisfies the third position.</w:t>
             </w:r>
           </w:p>
         </w:tc>
@@ -9480,6 +9521,47 @@
                 <w:sz w:val="19"/>
               </w:rPr>
               <w:t>Count of matched PIN rows in either Inactive or Stale state, divided by all tracked membership-dashboard units in the current master program view; unmatched units remain in the denominator.</w:t>
+            </w:r>
+          </w:p>
+        </w:tc>
+      </w:tr>
+      <w:tr>
+        <w:trPr>
+          <w:cantSplit/>
+        </w:trPr>
+        <w:tc>
+          <w:tcPr>
+            <w:tcW w:type="dxa" w:w="2700"/>
+          </w:tcPr>
+          <w:p>
+            <w:pPr>
+              <w:spacing w:after="0"/>
+            </w:pPr>
+            <w:r>
+              <w:rPr>
+                <w:rFonts w:ascii="Calibri" w:hAnsi="Calibri"/>
+                <w:color w:val="122033"/>
+                <w:sz w:val="19"/>
+              </w:rPr>
+              <w:t>Unit Key 3 completion</w:t>
+            </w:r>
+          </w:p>
+        </w:tc>
+        <w:tc>
+          <w:tcPr>
+            <w:tcW w:type="dxa" w:w="6660"/>
+          </w:tcPr>
+          <w:p>
+            <w:pPr>
+              <w:spacing w:after="0"/>
+            </w:pPr>
+            <w:r>
+              <w:rPr>
+                <w:rFonts w:ascii="Calibri" w:hAnsi="Calibri"/>
+                <w:color w:val="122033"/>
+                <w:sz w:val="19"/>
+              </w:rPr>
+              <w:t>Tracked units with a current program-specific Unit Leader, Committee Chair, and either a current COR or CUR, divided by all tracked units in the selected view. Current means registration expiration is on or after the report date.</w:t>
             </w:r>
           </w:p>
         </w:tc>

</xml_diff>

<commit_message>
Group Unit Key 3 detail by service area
</commit_message>
<xml_diff>
--- a/docs/Council-Dashboard-Summary-Source-and-Calculation-Guide.docx
+++ b/docs/Council-Dashboard-Summary-Source-and-Calculation-Guide.docx
@@ -324,7 +324,7 @@
                 <w:color w:val="122033"/>
                 <w:sz w:val="19"/>
               </w:rPr>
-              <w:t>2026-08-23_Membership-Hub-Field-Service-monday-export.xlsx</w:t>
+              <w:t>2026-09-06_Membership-Hub-Field-Service-monday-export.xlsx</w:t>
             </w:r>
           </w:p>
         </w:tc>
@@ -1056,7 +1056,7 @@
                 <w:color w:val="122033"/>
                 <w:sz w:val="19"/>
               </w:rPr>
-              <w:t>208</w:t>
+              <w:t>205</w:t>
             </w:r>
           </w:p>
         </w:tc>
@@ -1220,7 +1220,7 @@
                 <w:color w:val="122033"/>
                 <w:sz w:val="19"/>
               </w:rPr>
-              <w:t>92 (32.7%)</w:t>
+              <w:t>99 (35.2%)</w:t>
             </w:r>
           </w:p>
         </w:tc>
@@ -4900,7 +4900,7 @@
                 <w:color w:val="122033"/>
                 <w:sz w:val="19"/>
               </w:rPr>
-              <w:t>Which units have current Unit Leader, Committee Chair, and COR/CUR coverage, which positions are missing, and how completion compares by unit type. Either a current COR or CUR satisfies the third position.</w:t>
+              <w:t>Which units have current Unit Leader, Committee Chair, and COR/CUR coverage, which positions are missing, and how completion compares by unit type. Detail is organized in collapsible Service Area and District groups. Either a current COR or CUR satisfies the third position.</w:t>
             </w:r>
           </w:p>
         </w:tc>

</xml_diff>

<commit_message>
Apply Explorer Post Key 3 rule
</commit_message>
<xml_diff>
--- a/docs/Council-Dashboard-Summary-Source-and-Calculation-Guide.docx
+++ b/docs/Council-Dashboard-Summary-Source-and-Calculation-Guide.docx
@@ -4900,7 +4900,7 @@
                 <w:color w:val="122033"/>
                 <w:sz w:val="19"/>
               </w:rPr>
-              <w:t>Which units have current Unit Leader, Committee Chair, and COR/CUR coverage, which positions are missing, and how completion compares by unit type. Detail is organized in collapsible Service Area and District groups and shows SYT expiration beneath each holder, with expired or 90-day dates in red. Either a current COR or CUR satisfies the third position.</w:t>
+              <w:t>Which units have their applicable current Key 3 coverage, which positions are missing, and how completion compares by unit type. Packs, Troops, Crews, and Ships require Unit Leader, Committee Chair, and a third position; either a current COR or CUR satisfies that third position. Explorer Posts require only a current Post Advisor and Committee Chair. Detail is organized in collapsible Service Area and District groups and shows SYT expiration beneath each holder, with expired or 90-day dates in red.</w:t>
             </w:r>
           </w:p>
         </w:tc>
@@ -9561,7 +9561,7 @@
                 <w:color w:val="122033"/>
                 <w:sz w:val="19"/>
               </w:rPr>
-              <w:t>Tracked units with a current program-specific Unit Leader, Committee Chair, and either a current COR or CUR, divided by all tracked units in the selected view. Current means registration expiration is on or after the report date.</w:t>
+              <w:t>Tracked units with all applicable current roles divided by all tracked units in the selected view. Packs, Troops, Crews, and Ships require a program-specific Unit Leader, Committee Chair, and either a current COR or CUR. Explorer Posts require only a current Post Advisor and Committee Chair. Current means registration expiration is on or after the report date.</w:t>
             </w:r>
           </w:p>
         </w:tc>

</xml_diff>

<commit_message>
Restore COR requirement for Explorer Posts
</commit_message>
<xml_diff>
--- a/docs/Council-Dashboard-Summary-Source-and-Calculation-Guide.docx
+++ b/docs/Council-Dashboard-Summary-Source-and-Calculation-Guide.docx
@@ -4900,7 +4900,7 @@
                 <w:color w:val="122033"/>
                 <w:sz w:val="19"/>
               </w:rPr>
-              <w:t>Which units have their applicable current Key 3 coverage, which positions are missing, and how completion compares by unit type. Packs, Troops, Crews, and Ships require Unit Leader, Committee Chair, and a third position; either a current COR or CUR satisfies that third position. Explorer Posts require only a current Post Advisor and Committee Chair. Detail is organized in collapsible Service Area and District groups and shows SYT expiration beneath each holder, with expired or 90-day dates in red.</w:t>
+              <w:t>Which units have current Unit Leader, Committee Chair, and COR/CUR coverage, which positions are missing, and how completion compares by unit type. Detail is organized in collapsible Service Area and District groups and shows SYT expiration beneath each holder, with expired or 90-day dates in red. Either a current COR or CUR satisfies the third position.</w:t>
             </w:r>
           </w:p>
         </w:tc>
@@ -9561,7 +9561,7 @@
                 <w:color w:val="122033"/>
                 <w:sz w:val="19"/>
               </w:rPr>
-              <w:t>Tracked units with all applicable current roles divided by all tracked units in the selected view. Packs, Troops, Crews, and Ships require a program-specific Unit Leader, Committee Chair, and either a current COR or CUR. Explorer Posts require only a current Post Advisor and Committee Chair. Current means registration expiration is on or after the report date.</w:t>
+              <w:t>Tracked units with a current program-specific Unit Leader, Committee Chair, and either a current COR or CUR, divided by all tracked units in the selected view. Current means registration expiration is on or after the report date.</w:t>
             </w:r>
           </w:p>
         </w:tc>

</xml_diff>